<commit_message>
refact lessons part 2
</commit_message>
<xml_diff>
--- a/public/lesson-19.docx
+++ b/public/lesson-19.docx
@@ -5,66 +5,190 @@
     <w:p>
       <w:pPr>
         <w:pStyle w:val="Heading2"/>
-        <w:rPr>
-          <w:b w:val="0"/>
-          <w:i w:val="0"/>
-        </w:rPr>
       </w:pPr>
-      <w:r>
-        <w:rPr>
-          <w:b w:val="0"/>
-          <w:i w:val="0"/>
-        </w:rPr>
-        <w:t>Урок 19. Физика стоиков</w:t>
-      </w:r>
+      <w:proofErr w:type="spellStart"/>
+      <w:r>
+        <w:t>Не</w:t>
+      </w:r>
+      <w:proofErr w:type="spellEnd"/>
+      <w:r>
+        <w:t xml:space="preserve"> </w:t>
+      </w:r>
+      <w:proofErr w:type="spellStart"/>
+      <w:r>
+        <w:t>физика</w:t>
+      </w:r>
+      <w:proofErr w:type="spellEnd"/>
+      <w:r>
+        <w:t>,</w:t>
+      </w:r>
+      <w:r>
+        <w:t xml:space="preserve"> а </w:t>
+      </w:r>
+      <w:proofErr w:type="spellStart"/>
+      <w:r>
+        <w:t>онтология</w:t>
+      </w:r>
+      <w:proofErr w:type="spellEnd"/>
     </w:p>
     <w:p>
       <w:pPr>
         <w:rPr>
+          <w:rFonts w:ascii="Times New Roman" w:hAnsi="Times New Roman" w:cs="Times New Roman"/>
+          <w:sz w:val="24"/>
+          <w:szCs w:val="24"/>
           <w:lang w:val="ru-RU"/>
         </w:rPr>
       </w:pPr>
       <w:r>
         <w:rPr>
-          <w:lang w:val="ru-RU"/>
-        </w:rPr>
-        <w:t>То, что называли «физикой» стоики, не является физикой в современном её понимании. Более корректно было бы сказать онтология стоиков, то есть знание о том, что вообще такое реальность.</w:t>
+          <w:rFonts w:ascii="Times New Roman" w:hAnsi="Times New Roman" w:cs="Times New Roman"/>
+          <w:sz w:val="24"/>
+          <w:szCs w:val="24"/>
+          <w:lang w:val="ru-RU"/>
+        </w:rPr>
+        <w:t>То, что называли физикой стоики, не является физикой в современном её понимании. Более корректно было бы сказать онтология стоиков, то есть знание о том, что вообще такое реальность.</w:t>
       </w:r>
     </w:p>
     <w:p>
       <w:pPr>
         <w:rPr>
+          <w:rFonts w:ascii="Times New Roman" w:hAnsi="Times New Roman" w:cs="Times New Roman"/>
+          <w:sz w:val="24"/>
+          <w:szCs w:val="24"/>
           <w:lang w:val="ru-RU"/>
         </w:rPr>
       </w:pPr>
       <w:r>
         <w:rPr>
-          <w:lang w:val="ru-RU"/>
-        </w:rPr>
-        <w:t>Итак, образ действия на прошлом уроке был изучен. Теперь выведем на основе того, что реальность позволила нам осуществить наши действия (достигнуть атараксии), знание о мире. Отличие онтологии стоиков от онтологии Платона и Аристотеля в том, что она не вводит «второй реальности». Она представляет собой прото-материалистическую модель, не находясь в прямой конфронтации с экспериментально картиной мира. Более того, у стоиков есть ответ на вопрос, откуда в объяснениях Платона и Аристотеля берется вторая реальность.</w:t>
+          <w:rFonts w:ascii="Times New Roman" w:hAnsi="Times New Roman" w:cs="Times New Roman"/>
+          <w:sz w:val="24"/>
+          <w:szCs w:val="24"/>
+          <w:lang w:val="ru-RU"/>
+        </w:rPr>
+        <w:t xml:space="preserve">Итак, образ действия на прошлом уроке был изучен. Теперь выведем на основе того, что реальность позволила нам осуществить наши действия (достигнуть </w:t>
+      </w:r>
+      <w:r>
+        <w:rPr>
+          <w:rFonts w:ascii="Times New Roman" w:hAnsi="Times New Roman" w:cs="Times New Roman"/>
+          <w:i/>
+          <w:iCs/>
+          <w:sz w:val="24"/>
+          <w:szCs w:val="24"/>
+          <w:lang w:val="ru-RU"/>
+        </w:rPr>
+        <w:t>атараксии</w:t>
+      </w:r>
+      <w:r>
+        <w:rPr>
+          <w:rFonts w:ascii="Times New Roman" w:hAnsi="Times New Roman" w:cs="Times New Roman"/>
+          <w:sz w:val="24"/>
+          <w:szCs w:val="24"/>
+          <w:lang w:val="ru-RU"/>
+        </w:rPr>
+        <w:t xml:space="preserve">), знание о мире. Отличие онтологии стоиков от онтологии Платона и Аристотеля в том, что она не вводит «второй реальности». Она представляет собой </w:t>
+      </w:r>
+      <w:proofErr w:type="spellStart"/>
+      <w:r>
+        <w:rPr>
+          <w:rFonts w:ascii="Times New Roman" w:hAnsi="Times New Roman" w:cs="Times New Roman"/>
+          <w:sz w:val="24"/>
+          <w:szCs w:val="24"/>
+          <w:lang w:val="ru-RU"/>
+        </w:rPr>
+        <w:t>прото</w:t>
+      </w:r>
+      <w:proofErr w:type="spellEnd"/>
+      <w:r>
+        <w:rPr>
+          <w:rFonts w:ascii="Times New Roman" w:hAnsi="Times New Roman" w:cs="Times New Roman"/>
+          <w:sz w:val="24"/>
+          <w:szCs w:val="24"/>
+          <w:lang w:val="ru-RU"/>
+        </w:rPr>
+        <w:t>-материалистическую модель, не находясь в прямой конфронтации с экспериментально картиной мира. Более того, у стоиков есть ответ на вопрос, откуда в объяснениях Платона и Аристотеля берется вторая реальность.</w:t>
       </w:r>
     </w:p>
     <w:p>
       <w:pPr>
         <w:rPr>
+          <w:rFonts w:ascii="Times New Roman" w:hAnsi="Times New Roman" w:cs="Times New Roman"/>
+          <w:sz w:val="24"/>
+          <w:szCs w:val="24"/>
           <w:lang w:val="ru-RU"/>
         </w:rPr>
       </w:pPr>
       <w:r>
         <w:rPr>
-          <w:lang w:val="ru-RU"/>
-        </w:rPr>
-        <w:t>Итак, у нас есть пример Марка Аврелия, в котором есть точка выбора, соглашаться ли нам с суждением о страсти или не соглашаться. Вопрос: какова реальность в этой точке? Что вообще такое свобода выбора (именно управления страстями?).</w:t>
-      </w:r>
+          <w:rFonts w:ascii="Times New Roman" w:hAnsi="Times New Roman" w:cs="Times New Roman"/>
+          <w:sz w:val="24"/>
+          <w:szCs w:val="24"/>
+          <w:lang w:val="ru-RU"/>
+        </w:rPr>
+        <w:t>Итак, у нас есть пример Марка Аврелия, в котором есть точка выбора, соглашаться ли нам с суждением о страсти или не соглашаться. Вопрос: какова реальность в этой точке? Что вообще такое свобода выбора (именно</w:t>
+      </w:r>
+      <w:r>
+        <w:rPr>
+          <w:rFonts w:ascii="Times New Roman" w:hAnsi="Times New Roman" w:cs="Times New Roman"/>
+          <w:sz w:val="24"/>
+          <w:szCs w:val="24"/>
+          <w:lang w:val="ru-RU"/>
+        </w:rPr>
+        <w:t xml:space="preserve"> в смысле</w:t>
+      </w:r>
+      <w:r>
+        <w:rPr>
+          <w:rFonts w:ascii="Times New Roman" w:hAnsi="Times New Roman" w:cs="Times New Roman"/>
+          <w:sz w:val="24"/>
+          <w:szCs w:val="24"/>
+          <w:lang w:val="ru-RU"/>
+        </w:rPr>
+        <w:t xml:space="preserve"> управления страстями</w:t>
+      </w:r>
+      <w:proofErr w:type="gramStart"/>
+      <w:r>
+        <w:rPr>
+          <w:rFonts w:ascii="Times New Roman" w:hAnsi="Times New Roman" w:cs="Times New Roman"/>
+          <w:sz w:val="24"/>
+          <w:szCs w:val="24"/>
+          <w:lang w:val="ru-RU"/>
+        </w:rPr>
+        <w:t>)</w:t>
+      </w:r>
+      <w:r>
+        <w:rPr>
+          <w:rFonts w:ascii="Times New Roman" w:hAnsi="Times New Roman" w:cs="Times New Roman"/>
+          <w:sz w:val="24"/>
+          <w:szCs w:val="24"/>
+          <w:lang w:val="ru-RU"/>
+        </w:rPr>
+        <w:t>?</w:t>
+      </w:r>
+      <w:r>
+        <w:rPr>
+          <w:rFonts w:ascii="Times New Roman" w:hAnsi="Times New Roman" w:cs="Times New Roman"/>
+          <w:sz w:val="24"/>
+          <w:szCs w:val="24"/>
+          <w:lang w:val="ru-RU"/>
+        </w:rPr>
+        <w:t>.</w:t>
+      </w:r>
+      <w:proofErr w:type="gramEnd"/>
     </w:p>
     <w:p>
       <w:pPr>
         <w:rPr>
+          <w:rFonts w:ascii="Times New Roman" w:hAnsi="Times New Roman" w:cs="Times New Roman"/>
+          <w:sz w:val="24"/>
+          <w:szCs w:val="24"/>
           <w:lang w:val="ru-RU"/>
         </w:rPr>
       </w:pPr>
       <w:r>
         <w:rPr>
+          <w:rFonts w:ascii="Times New Roman" w:hAnsi="Times New Roman" w:cs="Times New Roman"/>
+          <w:sz w:val="24"/>
+          <w:szCs w:val="24"/>
           <w:lang w:val="ru-RU"/>
         </w:rPr>
         <w:t>В этом контексте можно рассматривать жизнь двумя способами:</w:t>
@@ -77,24 +201,47 @@
           <w:numId w:val="5"/>
         </w:numPr>
         <w:rPr>
+          <w:rFonts w:ascii="Times New Roman" w:hAnsi="Times New Roman" w:cs="Times New Roman"/>
+          <w:sz w:val="24"/>
+          <w:szCs w:val="24"/>
           <w:lang w:val="ru-RU"/>
         </w:rPr>
       </w:pPr>
       <w:r>
         <w:rPr>
-          <w:lang w:val="ru-RU"/>
-        </w:rPr>
-        <w:t xml:space="preserve">как целостность, совокупность, протяженность, </w:t>
-      </w:r>
-      <w:r>
-        <w:rPr>
-          <w:i/>
+          <w:rFonts w:ascii="Times New Roman" w:hAnsi="Times New Roman" w:cs="Times New Roman"/>
+          <w:sz w:val="24"/>
+          <w:szCs w:val="24"/>
+          <w:lang w:val="ru-RU"/>
+        </w:rPr>
+        <w:t>К</w:t>
+      </w:r>
+      <w:r>
+        <w:rPr>
+          <w:rFonts w:ascii="Times New Roman" w:hAnsi="Times New Roman" w:cs="Times New Roman"/>
+          <w:sz w:val="24"/>
+          <w:szCs w:val="24"/>
+          <w:lang w:val="ru-RU"/>
+        </w:rPr>
+        <w:t xml:space="preserve">ак целостность, совокупность, протяженность, </w:t>
+      </w:r>
+      <w:r>
+        <w:rPr>
+          <w:rFonts w:ascii="Times New Roman" w:hAnsi="Times New Roman" w:cs="Times New Roman"/>
+          <w:b/>
+          <w:bCs/>
+          <w:iCs/>
+          <w:sz w:val="24"/>
+          <w:szCs w:val="24"/>
           <w:lang w:val="ru-RU"/>
         </w:rPr>
         <w:t>экстенсивность</w:t>
       </w:r>
       <w:r>
         <w:rPr>
+          <w:rFonts w:ascii="Times New Roman" w:hAnsi="Times New Roman" w:cs="Times New Roman"/>
+          <w:sz w:val="24"/>
+          <w:szCs w:val="24"/>
           <w:lang w:val="ru-RU"/>
         </w:rPr>
         <w:t xml:space="preserve"> (вид со стороны, от третьего лица)</w:t>
@@ -107,11 +254,17 @@
           <w:numId w:val="5"/>
         </w:numPr>
         <w:rPr>
+          <w:rFonts w:ascii="Times New Roman" w:hAnsi="Times New Roman" w:cs="Times New Roman"/>
+          <w:sz w:val="24"/>
+          <w:szCs w:val="24"/>
           <w:lang w:val="ru-RU"/>
         </w:rPr>
       </w:pPr>
       <w:r>
         <w:rPr>
+          <w:rFonts w:ascii="Times New Roman" w:hAnsi="Times New Roman" w:cs="Times New Roman"/>
+          <w:sz w:val="24"/>
+          <w:szCs w:val="24"/>
           <w:lang w:val="ru-RU"/>
         </w:rPr>
         <w:t>Жизнь в настоящем (вид от первого лица, я субъект).</w:t>
@@ -119,6 +272,7 @@
     </w:p>
     <w:p>
       <w:pPr>
+        <w:pStyle w:val="Quote"/>
         <w:rPr>
           <w:lang w:val="ru-RU"/>
         </w:rPr>
@@ -127,11 +281,66 @@
         <w:rPr>
           <w:lang w:val="ru-RU"/>
         </w:rPr>
-        <w:t>Кстати, в христианстве вид от «второго лица»: например, вся исповедь Августина написана обращением к богу на «ты».</w:t>
+        <w:t>Можно сказать</w:t>
+      </w:r>
+      <w:r>
+        <w:rPr>
+          <w:lang w:val="ru-RU"/>
+        </w:rPr>
+        <w:t>,</w:t>
+      </w:r>
+      <w:r>
+        <w:rPr>
+          <w:lang w:val="ru-RU"/>
+        </w:rPr>
+        <w:t xml:space="preserve"> что</w:t>
+      </w:r>
+      <w:r>
+        <w:rPr>
+          <w:lang w:val="ru-RU"/>
+        </w:rPr>
+        <w:t xml:space="preserve"> в христианстве </w:t>
+      </w:r>
+      <w:r>
+        <w:rPr>
+          <w:lang w:val="ru-RU"/>
+        </w:rPr>
+        <w:t xml:space="preserve">особый </w:t>
+      </w:r>
+      <w:r>
+        <w:rPr>
+          <w:lang w:val="ru-RU"/>
+        </w:rPr>
+        <w:t>вид от «второго лица»</w:t>
+      </w:r>
+      <w:r>
+        <w:rPr>
+          <w:lang w:val="ru-RU"/>
+        </w:rPr>
+        <w:t xml:space="preserve"> из-за познавания мира через личностного бога.</w:t>
+      </w:r>
+      <w:r>
+        <w:rPr>
+          <w:lang w:val="ru-RU"/>
+        </w:rPr>
+        <w:t xml:space="preserve"> </w:t>
+      </w:r>
+      <w:r>
+        <w:rPr>
+          <w:lang w:val="ru-RU"/>
+        </w:rPr>
+        <w:t>Н</w:t>
+      </w:r>
+      <w:r>
+        <w:rPr>
+          <w:lang w:val="ru-RU"/>
+        </w:rPr>
+        <w:t>апример, вся исповедь Августина написана обращением к богу на «ты».</w:t>
       </w:r>
     </w:p>
     <w:p>
       <w:pPr>
+        <w:pStyle w:val="Heading2"/>
         <w:rPr>
           <w:lang w:val="ru-RU"/>
         </w:rPr>
@@ -140,110 +349,236 @@
         <w:rPr>
           <w:lang w:val="ru-RU"/>
         </w:rPr>
-        <w:t xml:space="preserve">Рассмотрим пример: если нам показать кружку, а потом попросить её описать, мы перечислим её свойства: белая, объемная, усеченный конус. В момент настоящего воспринимания кружки мы </w:t>
-      </w:r>
-      <w:r>
-        <w:rPr>
-          <w:i/>
-          <w:lang w:val="ru-RU"/>
-        </w:rPr>
-        <w:t>переживали</w:t>
-      </w:r>
-      <w:r>
-        <w:rPr>
-          <w:lang w:val="ru-RU"/>
-        </w:rPr>
-        <w:t xml:space="preserve"> её в настоящем. При попытке вспомнить кружку, мы создаем её «топологическую» модель, делаем «распаковку», проскакивая тот момент настоящего, когда нам доступно истинное знание о том, что на самом деле такое мир. В этом разница онтологии стоиков с онтологией Платона и Аристотеля: последние говорят о том, что истина скрыта от нас во второй реальности, а первые о том, что она прячется от нас во времени, она в моменте настоящего, который неуловим.</w:t>
+        <w:t>Распаковка кружки</w:t>
       </w:r>
     </w:p>
     <w:p>
       <w:pPr>
         <w:rPr>
+          <w:rFonts w:ascii="Times New Roman" w:hAnsi="Times New Roman" w:cs="Times New Roman"/>
+          <w:sz w:val="24"/>
+          <w:szCs w:val="24"/>
           <w:lang w:val="ru-RU"/>
         </w:rPr>
       </w:pPr>
       <w:r>
         <w:rPr>
-          <w:lang w:val="ru-RU"/>
-        </w:rPr>
-        <w:t xml:space="preserve">Она — это нечто неделимое, не суммируемое, </w:t>
-      </w:r>
-      <w:r>
-        <w:rPr>
-          <w:i/>
-          <w:lang w:val="ru-RU"/>
-        </w:rPr>
-        <w:t>интенсивное.</w:t>
-      </w:r>
-      <w:r>
-        <w:rPr>
-          <w:lang w:val="ru-RU"/>
-        </w:rPr>
-        <w:t xml:space="preserve"> Пример экстенсивного свойства: масса — если поделить предмет пополам, масса новых предметов будет поделенной пополам массой первого предмета; пример интенсивного свойства: цвет — если сломать пополам предмет, цвет у новых предметов будет тем же. Так вот, это интенсивное нечто, присутствует в настоящем </w:t>
-      </w:r>
-      <w:r>
-        <w:rPr>
+          <w:rFonts w:ascii="Times New Roman" w:hAnsi="Times New Roman" w:cs="Times New Roman"/>
+          <w:sz w:val="24"/>
+          <w:szCs w:val="24"/>
+          <w:lang w:val="ru-RU"/>
+        </w:rPr>
+        <w:t>Е</w:t>
+      </w:r>
+      <w:r>
+        <w:rPr>
+          <w:rFonts w:ascii="Times New Roman" w:hAnsi="Times New Roman" w:cs="Times New Roman"/>
+          <w:sz w:val="24"/>
+          <w:szCs w:val="24"/>
+          <w:lang w:val="ru-RU"/>
+        </w:rPr>
+        <w:t xml:space="preserve">сли нам показать кружку, а потом попросить её описать, мы перечислим её свойства: белая, объемная, усеченный конус. В момент </w:t>
+      </w:r>
+      <w:r>
+        <w:rPr>
+          <w:rFonts w:ascii="Times New Roman" w:hAnsi="Times New Roman" w:cs="Times New Roman"/>
+          <w:sz w:val="24"/>
+          <w:szCs w:val="24"/>
+          <w:lang w:val="ru-RU"/>
+        </w:rPr>
+        <w:t>непосредственно</w:t>
+      </w:r>
+      <w:r>
+        <w:rPr>
+          <w:rFonts w:ascii="Times New Roman" w:hAnsi="Times New Roman" w:cs="Times New Roman"/>
+          <w:sz w:val="24"/>
+          <w:szCs w:val="24"/>
+          <w:lang w:val="ru-RU"/>
+        </w:rPr>
+        <w:t xml:space="preserve"> воспринимания кружки мы </w:t>
+      </w:r>
+      <w:r>
+        <w:rPr>
+          <w:rFonts w:ascii="Times New Roman" w:hAnsi="Times New Roman" w:cs="Times New Roman"/>
           <w:b/>
-          <w:lang w:val="ru-RU"/>
-        </w:rPr>
-        <w:t>целиком</w:t>
-      </w:r>
-      <w:r>
-        <w:rPr>
-          <w:lang w:val="ru-RU"/>
-        </w:rPr>
-        <w:t>.</w:t>
+          <w:bCs/>
+          <w:iCs/>
+          <w:sz w:val="24"/>
+          <w:szCs w:val="24"/>
+          <w:lang w:val="ru-RU"/>
+        </w:rPr>
+        <w:t>переживали</w:t>
+      </w:r>
+      <w:r>
+        <w:rPr>
+          <w:rFonts w:ascii="Times New Roman" w:hAnsi="Times New Roman" w:cs="Times New Roman"/>
+          <w:sz w:val="24"/>
+          <w:szCs w:val="24"/>
+          <w:lang w:val="ru-RU"/>
+        </w:rPr>
+        <w:t xml:space="preserve"> её в настоящем. При попытке вспомнить кружку, мы создаем её </w:t>
+      </w:r>
+      <w:r>
+        <w:rPr>
+          <w:rFonts w:ascii="Times New Roman" w:hAnsi="Times New Roman" w:cs="Times New Roman"/>
+          <w:b/>
+          <w:bCs/>
+          <w:sz w:val="24"/>
+          <w:szCs w:val="24"/>
+          <w:lang w:val="ru-RU"/>
+        </w:rPr>
+        <w:t>топологическую модель</w:t>
+      </w:r>
+      <w:r>
+        <w:rPr>
+          <w:rFonts w:ascii="Times New Roman" w:hAnsi="Times New Roman" w:cs="Times New Roman"/>
+          <w:sz w:val="24"/>
+          <w:szCs w:val="24"/>
+          <w:lang w:val="ru-RU"/>
+        </w:rPr>
+        <w:t xml:space="preserve">, делаем </w:t>
+      </w:r>
+      <w:r>
+        <w:rPr>
+          <w:rFonts w:ascii="Times New Roman" w:hAnsi="Times New Roman" w:cs="Times New Roman"/>
+          <w:b/>
+          <w:bCs/>
+          <w:sz w:val="24"/>
+          <w:szCs w:val="24"/>
+          <w:lang w:val="ru-RU"/>
+        </w:rPr>
+        <w:t>распаковку</w:t>
+      </w:r>
+      <w:r>
+        <w:rPr>
+          <w:rFonts w:ascii="Times New Roman" w:hAnsi="Times New Roman" w:cs="Times New Roman"/>
+          <w:sz w:val="24"/>
+          <w:szCs w:val="24"/>
+          <w:lang w:val="ru-RU"/>
+        </w:rPr>
+        <w:t>, проскакивая тот момент настоящего, когда нам доступно истинное знание о том, что на самом деле такое мир. В этом разница онтологии стоиков с онтологией Платона и Аристотеля: последние говорят о том, что истина скрыта от нас во второй реальности, а первые о том, что она прячется от нас во времени</w:t>
+      </w:r>
+      <w:r>
+        <w:rPr>
+          <w:rFonts w:ascii="Times New Roman" w:hAnsi="Times New Roman" w:cs="Times New Roman"/>
+          <w:sz w:val="24"/>
+          <w:szCs w:val="24"/>
+          <w:lang w:val="ru-RU"/>
+        </w:rPr>
+        <w:t>:</w:t>
+      </w:r>
+      <w:r>
+        <w:rPr>
+          <w:rFonts w:ascii="Times New Roman" w:hAnsi="Times New Roman" w:cs="Times New Roman"/>
+          <w:sz w:val="24"/>
+          <w:szCs w:val="24"/>
+          <w:lang w:val="ru-RU"/>
+        </w:rPr>
+        <w:t xml:space="preserve"> она в моменте настоящего, который неуловим.</w:t>
       </w:r>
     </w:p>
     <w:p>
       <w:pPr>
         <w:rPr>
+          <w:rFonts w:ascii="Times New Roman" w:hAnsi="Times New Roman" w:cs="Times New Roman"/>
+          <w:sz w:val="24"/>
+          <w:szCs w:val="24"/>
           <w:lang w:val="ru-RU"/>
         </w:rPr>
       </w:pPr>
       <w:r>
         <w:rPr>
-          <w:lang w:val="ru-RU"/>
-        </w:rPr>
-        <w:t xml:space="preserve">Что же такое переживание? Для объяснения этого состояния был введен термин «тонос» (натяжение лука) — натяжение, напряжение. Переживать — находиться в неком напряжении. Но это не нервное напряжение и не равновесие! Это скорее бодрость, концентрация сил. Это некоторая величина, у которой есть значение: тоноса может быть больше или меньше, он неделим, но изменяется с течением времени. Любое понятие страсти (боль, удовольствие) появляется при развертке (создании топологической модели), объединении нескольких состояний сразу. Сущность, которая может иметь разные значения тоноса — </w:t>
-      </w:r>
-      <w:r>
-        <w:rPr>
+          <w:rFonts w:ascii="Times New Roman" w:hAnsi="Times New Roman" w:cs="Times New Roman"/>
+          <w:sz w:val="24"/>
+          <w:szCs w:val="24"/>
+          <w:lang w:val="ru-RU"/>
+        </w:rPr>
+        <w:t>Истина</w:t>
+      </w:r>
+      <w:r>
+        <w:rPr>
+          <w:rFonts w:ascii="Times New Roman" w:hAnsi="Times New Roman" w:cs="Times New Roman"/>
+          <w:sz w:val="24"/>
+          <w:szCs w:val="24"/>
+          <w:lang w:val="ru-RU"/>
+        </w:rPr>
+        <w:t xml:space="preserve"> — это нечто неделимое, не суммируемое, </w:t>
+      </w:r>
+      <w:r>
+        <w:rPr>
+          <w:rFonts w:ascii="Times New Roman" w:hAnsi="Times New Roman" w:cs="Times New Roman"/>
           <w:b/>
+          <w:bCs/>
+          <w:iCs/>
+          <w:sz w:val="24"/>
+          <w:szCs w:val="24"/>
+          <w:lang w:val="ru-RU"/>
+        </w:rPr>
+        <w:t>интенсивное</w:t>
+      </w:r>
+      <w:r>
+        <w:rPr>
+          <w:rFonts w:ascii="Times New Roman" w:hAnsi="Times New Roman" w:cs="Times New Roman"/>
           <w:i/>
-          <w:lang w:val="ru-RU"/>
-        </w:rPr>
-        <w:t>пневма</w:t>
-      </w:r>
-      <w:r>
-        <w:rPr>
-          <w:lang w:val="ru-RU"/>
-        </w:rPr>
-        <w:t xml:space="preserve"> (ветер, дуновение, дыхание). Именно благодаря ей существуют мышление, восприятие, сознание. Пневма — это то, </w:t>
-      </w:r>
-      <w:r>
-        <w:rPr>
-          <w:i/>
-          <w:lang w:val="ru-RU"/>
-        </w:rPr>
-        <w:t>что</w:t>
-      </w:r>
-      <w:r>
-        <w:rPr>
-          <w:lang w:val="ru-RU"/>
-        </w:rPr>
-        <w:t xml:space="preserve"> переживает. Человек это и есть пневма. Все наши воспоминания это проявления пневмы. Человек отличается от животного более высоким уровнем интенсивности пневмы, потому что </w:t>
-      </w:r>
-      <w:r>
-        <w:rPr>
-          <w:lang w:val="ru-RU"/>
-        </w:rPr>
-        <w:lastRenderedPageBreak/>
-        <w:t>человек способен на большее количество вещей. В нем пневма проявляет себя более активно. Но пневма проявляется не только в мышлении или сознании.</w:t>
+          <w:sz w:val="24"/>
+          <w:szCs w:val="24"/>
+          <w:lang w:val="ru-RU"/>
+        </w:rPr>
+        <w:t xml:space="preserve"> </w:t>
+      </w:r>
+      <w:r>
+        <w:rPr>
+          <w:rFonts w:ascii="Times New Roman" w:hAnsi="Times New Roman" w:cs="Times New Roman"/>
+          <w:sz w:val="24"/>
+          <w:szCs w:val="24"/>
+          <w:lang w:val="ru-RU"/>
+        </w:rPr>
+        <w:t xml:space="preserve">нечто, </w:t>
+      </w:r>
+      <w:r>
+        <w:rPr>
+          <w:rFonts w:ascii="Times New Roman" w:hAnsi="Times New Roman" w:cs="Times New Roman"/>
+          <w:sz w:val="24"/>
+          <w:szCs w:val="24"/>
+          <w:u w:val="single"/>
+          <w:lang w:val="ru-RU"/>
+        </w:rPr>
+        <w:t>присутствующее</w:t>
+      </w:r>
+      <w:r>
+        <w:rPr>
+          <w:rFonts w:ascii="Times New Roman" w:hAnsi="Times New Roman" w:cs="Times New Roman"/>
+          <w:sz w:val="24"/>
+          <w:szCs w:val="24"/>
+          <w:u w:val="single"/>
+          <w:lang w:val="ru-RU"/>
+        </w:rPr>
+        <w:t xml:space="preserve"> в настоящем </w:t>
+      </w:r>
+      <w:r>
+        <w:rPr>
+          <w:rFonts w:ascii="Times New Roman" w:hAnsi="Times New Roman" w:cs="Times New Roman"/>
+          <w:bCs/>
+          <w:sz w:val="24"/>
+          <w:szCs w:val="24"/>
+          <w:u w:val="single"/>
+          <w:lang w:val="ru-RU"/>
+        </w:rPr>
+        <w:t>целиком</w:t>
+      </w:r>
+      <w:r>
+        <w:rPr>
+          <w:rFonts w:ascii="Times New Roman" w:hAnsi="Times New Roman" w:cs="Times New Roman"/>
+          <w:sz w:val="24"/>
+          <w:szCs w:val="24"/>
+          <w:lang w:val="ru-RU"/>
+        </w:rPr>
+        <w:t>.</w:t>
       </w:r>
     </w:p>
     <w:p>
       <w:pPr>
+        <w:pStyle w:val="Quote"/>
         <w:rPr>
           <w:lang w:val="ru-RU"/>
         </w:rPr>
@@ -252,11 +587,12 @@
         <w:rPr>
           <w:lang w:val="ru-RU"/>
         </w:rPr>
-        <w:t>Почему пневма является условием свободы воли? Почему пневма является характеристикой свободы воли? Каковы условия физической реальности, которая обеспечивает нашу свободу воли?</w:t>
+        <w:t xml:space="preserve">Пример экстенсивного свойства: масса — если поделить предмет пополам, масса новых предметов будет поделенной пополам массой первого предмета; пример интенсивного свойства: цвет — если сломать пополам предмет, цвет у новых предметов будет тем же. </w:t>
       </w:r>
     </w:p>
     <w:p>
       <w:pPr>
+        <w:pStyle w:val="Heading2"/>
         <w:rPr>
           <w:lang w:val="ru-RU"/>
         </w:rPr>
@@ -265,122 +601,1638 @@
         <w:rPr>
           <w:lang w:val="ru-RU"/>
         </w:rPr>
-        <w:t>Так или иначе, человек существует среди протяженных материальных тел, которые являются разверткой. Для этих тел у стоиков есть понятие — «</w:t>
-      </w:r>
-      <w:r>
-        <w:rPr>
-          <w:b/>
-          <w:lang w:val="ru-RU"/>
-        </w:rPr>
-        <w:t>гюле</w:t>
-      </w:r>
-      <w:r>
-        <w:rPr>
-          <w:lang w:val="ru-RU"/>
-        </w:rPr>
-        <w:t xml:space="preserve">» (материя). Это протяженное, твердое, непроницаемое и мы живем в мире гюле. Но если бы в мире существовала только гюле, свободы воли бы не существовало, а была бы только одна твердая, непроницаемая материя. Так что помимо гюле существует пневма — интенсивная сущность. Она и является условием свободы воли и существует в физической реальности. Аналогия пневмы для понимания: электромагнитное поле. Понятие эл-м поля долго вымещалось из-за существования другого понятия — </w:t>
-      </w:r>
-      <w:r>
-        <w:rPr>
-          <w:b/>
-          <w:lang w:val="ru-RU"/>
-        </w:rPr>
-        <w:t>эфир</w:t>
-      </w:r>
-      <w:r>
-        <w:rPr>
-          <w:lang w:val="ru-RU"/>
-        </w:rPr>
-        <w:t xml:space="preserve">. В классической механике, где существует только материальное вещество, когда все может мыслиться только топологически. Поэтому в одном месте не может одновременно находиться несколько тел. </w:t>
-      </w:r>
-      <w:r>
-        <w:rPr>
-          <w:lang w:val="ru-RU"/>
-        </w:rPr>
-        <w:t xml:space="preserve">Эфир же был средой, в которой существуют материальные тела. </w:t>
-      </w:r>
-      <w:r>
-        <w:rPr>
-          <w:lang w:val="ru-RU"/>
-        </w:rPr>
-        <w:t xml:space="preserve">Это — очень тонкая материя. Эфир не может проникать внутрь тела. Он окутывает тела. Но впоследствии опыта, который показал, что эфира не существует, было высказано предположение о том, что существует физическая сущность, живущая по другим законам, и что может быть в одном и том же месте с материей. Стоики же задолго до какой-либо науки выдвинули теорию «тотального смешения», в которой предполагали, что в одном месте </w:t>
-      </w:r>
-      <w:r>
-        <w:rPr>
-          <w:i/>
-          <w:lang w:val="ru-RU"/>
-        </w:rPr>
-        <w:t>может</w:t>
-      </w:r>
-      <w:r>
-        <w:rPr>
-          <w:lang w:val="ru-RU"/>
-        </w:rPr>
-        <w:t xml:space="preserve"> существовать несколько физических сущностей. Одна из сущностей как бы полностью проникает в материальные тела (гюле). Эта сущность и есть пневма. Одновременное сосуществование пневмы и гюле в момент настоящего — это и есть свобода воли. Свобода воли определяется некоторым значением пневмы. Но! Речь идёт именно о той свободе воли, которая связана с выбором того, подчиняться мне страстям или нет, про поступки и решения, которые существуют как продукт развертки, речи не идёт. Лучше в этом смысле свободу воли называть свободой суждения. Свобода воли в обычном её понимании, как автономия по принятию решений, касается христианства.</w:t>
+        <w:lastRenderedPageBreak/>
+        <w:t>Что такое переживание</w:t>
       </w:r>
     </w:p>
     <w:p>
       <w:pPr>
         <w:rPr>
+          <w:rFonts w:ascii="Times New Roman" w:hAnsi="Times New Roman" w:cs="Times New Roman"/>
+          <w:sz w:val="24"/>
+          <w:szCs w:val="24"/>
           <w:lang w:val="ru-RU"/>
         </w:rPr>
       </w:pPr>
       <w:r>
         <w:rPr>
-          <w:lang w:val="ru-RU"/>
-        </w:rPr>
-        <w:t xml:space="preserve">Возьмем человека и сравним его с гравитационной пылью в космосе. Если рассматривать его как целостность, как результат развертки, то различия будут огромны. Но если взять их в момент настоящего, как пневму в гюле, то различия будут минимальны — только в степени интенсивности пневмы. Более того, между человеком и пылью есть некое </w:t>
-      </w:r>
-      <w:r>
-        <w:rPr>
+          <w:rFonts w:ascii="Times New Roman" w:hAnsi="Times New Roman" w:cs="Times New Roman"/>
+          <w:sz w:val="24"/>
+          <w:szCs w:val="24"/>
+          <w:lang w:val="ru-RU"/>
+        </w:rPr>
+        <w:t xml:space="preserve">Для объяснения состояния </w:t>
+      </w:r>
+      <w:r>
+        <w:rPr>
+          <w:rFonts w:ascii="Times New Roman" w:hAnsi="Times New Roman" w:cs="Times New Roman"/>
+          <w:sz w:val="24"/>
+          <w:szCs w:val="24"/>
+          <w:lang w:val="ru-RU"/>
+        </w:rPr>
+        <w:t>пере</w:t>
+      </w:r>
+      <w:r>
+        <w:rPr>
+          <w:rFonts w:ascii="Times New Roman" w:hAnsi="Times New Roman" w:cs="Times New Roman"/>
+          <w:sz w:val="24"/>
+          <w:szCs w:val="24"/>
+          <w:lang w:val="ru-RU"/>
+        </w:rPr>
+        <w:t>ж</w:t>
+      </w:r>
+      <w:r>
+        <w:rPr>
+          <w:rFonts w:ascii="Times New Roman" w:hAnsi="Times New Roman" w:cs="Times New Roman"/>
+          <w:sz w:val="24"/>
+          <w:szCs w:val="24"/>
+          <w:lang w:val="ru-RU"/>
+        </w:rPr>
+        <w:t xml:space="preserve">ивания </w:t>
+      </w:r>
+      <w:r>
+        <w:rPr>
+          <w:rFonts w:ascii="Times New Roman" w:hAnsi="Times New Roman" w:cs="Times New Roman"/>
+          <w:sz w:val="24"/>
+          <w:szCs w:val="24"/>
+          <w:lang w:val="ru-RU"/>
+        </w:rPr>
+        <w:t>был введен термин</w:t>
+      </w:r>
+      <w:r>
+        <w:rPr>
+          <w:rFonts w:ascii="Times New Roman" w:hAnsi="Times New Roman" w:cs="Times New Roman"/>
+          <w:sz w:val="24"/>
+          <w:szCs w:val="24"/>
+          <w:lang w:val="ru-RU"/>
+        </w:rPr>
+        <w:t xml:space="preserve"> </w:t>
+      </w:r>
+      <w:proofErr w:type="spellStart"/>
+      <w:r>
+        <w:rPr>
+          <w:rFonts w:ascii="Times New Roman" w:hAnsi="Times New Roman" w:cs="Times New Roman"/>
+          <w:sz w:val="24"/>
+          <w:szCs w:val="24"/>
+          <w:lang w:val="ru-RU"/>
+        </w:rPr>
+        <w:t>τόνος</w:t>
+      </w:r>
+      <w:proofErr w:type="spellEnd"/>
+      <w:r>
+        <w:rPr>
+          <w:rFonts w:ascii="Times New Roman" w:hAnsi="Times New Roman" w:cs="Times New Roman"/>
+          <w:sz w:val="24"/>
+          <w:szCs w:val="24"/>
+          <w:lang w:val="ru-RU"/>
+        </w:rPr>
+        <w:t xml:space="preserve"> </w:t>
+      </w:r>
+      <w:r>
+        <w:rPr>
+          <w:rFonts w:ascii="Times New Roman" w:hAnsi="Times New Roman" w:cs="Times New Roman"/>
+          <w:sz w:val="24"/>
+          <w:szCs w:val="24"/>
+          <w:lang w:val="ru-RU"/>
+        </w:rPr>
+        <w:t>[</w:t>
+      </w:r>
+      <w:proofErr w:type="spellStart"/>
+      <w:r>
+        <w:rPr>
+          <w:rFonts w:ascii="Times New Roman" w:hAnsi="Times New Roman" w:cs="Times New Roman"/>
+          <w:b/>
+          <w:bCs/>
+          <w:sz w:val="24"/>
+          <w:szCs w:val="24"/>
+          <w:lang w:val="ru-RU"/>
+        </w:rPr>
+        <w:t>тонос</w:t>
+      </w:r>
+      <w:proofErr w:type="spellEnd"/>
+      <w:r>
+        <w:rPr>
+          <w:rFonts w:ascii="Times New Roman" w:hAnsi="Times New Roman" w:cs="Times New Roman"/>
+          <w:sz w:val="24"/>
+          <w:szCs w:val="24"/>
+          <w:lang w:val="ru-RU"/>
+        </w:rPr>
+        <w:t>]</w:t>
+      </w:r>
+      <w:r>
+        <w:rPr>
+          <w:rFonts w:ascii="Times New Roman" w:hAnsi="Times New Roman" w:cs="Times New Roman"/>
+          <w:sz w:val="24"/>
+          <w:szCs w:val="24"/>
+          <w:lang w:val="ru-RU"/>
+        </w:rPr>
+        <w:t xml:space="preserve"> — натяжение, напряжение</w:t>
+      </w:r>
+      <w:r>
+        <w:rPr>
+          <w:rFonts w:ascii="Times New Roman" w:hAnsi="Times New Roman" w:cs="Times New Roman"/>
+          <w:sz w:val="24"/>
+          <w:szCs w:val="24"/>
+          <w:lang w:val="ru-RU"/>
+        </w:rPr>
+        <w:t xml:space="preserve"> в смысле натяжения тетивы лука</w:t>
+      </w:r>
+      <w:r>
+        <w:rPr>
+          <w:rFonts w:ascii="Times New Roman" w:hAnsi="Times New Roman" w:cs="Times New Roman"/>
+          <w:sz w:val="24"/>
+          <w:szCs w:val="24"/>
+          <w:lang w:val="ru-RU"/>
+        </w:rPr>
+        <w:t>. Переживать —</w:t>
+      </w:r>
+      <w:r>
+        <w:rPr>
+          <w:rFonts w:ascii="Times New Roman" w:hAnsi="Times New Roman" w:cs="Times New Roman"/>
+          <w:sz w:val="24"/>
+          <w:szCs w:val="24"/>
+          <w:lang w:val="ru-RU"/>
+        </w:rPr>
+        <w:t xml:space="preserve"> значит</w:t>
+      </w:r>
+      <w:r>
+        <w:rPr>
+          <w:rFonts w:ascii="Times New Roman" w:hAnsi="Times New Roman" w:cs="Times New Roman"/>
+          <w:sz w:val="24"/>
+          <w:szCs w:val="24"/>
+          <w:lang w:val="ru-RU"/>
+        </w:rPr>
+        <w:t xml:space="preserve"> находиться в </w:t>
+      </w:r>
+      <w:proofErr w:type="spellStart"/>
+      <w:r>
+        <w:rPr>
+          <w:rFonts w:ascii="Times New Roman" w:hAnsi="Times New Roman" w:cs="Times New Roman"/>
+          <w:sz w:val="24"/>
+          <w:szCs w:val="24"/>
+          <w:lang w:val="ru-RU"/>
+        </w:rPr>
+        <w:t>неком</w:t>
+      </w:r>
+      <w:proofErr w:type="spellEnd"/>
+      <w:r>
+        <w:rPr>
+          <w:rFonts w:ascii="Times New Roman" w:hAnsi="Times New Roman" w:cs="Times New Roman"/>
+          <w:sz w:val="24"/>
+          <w:szCs w:val="24"/>
+          <w:lang w:val="ru-RU"/>
+        </w:rPr>
+        <w:t xml:space="preserve"> напряжении. </w:t>
+      </w:r>
+      <w:r>
+        <w:rPr>
+          <w:rFonts w:ascii="Times New Roman" w:hAnsi="Times New Roman" w:cs="Times New Roman"/>
+          <w:sz w:val="24"/>
+          <w:szCs w:val="24"/>
+          <w:lang w:val="ru-RU"/>
+        </w:rPr>
+        <w:t>Э</w:t>
+      </w:r>
+      <w:r>
+        <w:rPr>
+          <w:rFonts w:ascii="Times New Roman" w:hAnsi="Times New Roman" w:cs="Times New Roman"/>
+          <w:sz w:val="24"/>
+          <w:szCs w:val="24"/>
+          <w:lang w:val="ru-RU"/>
+        </w:rPr>
+        <w:t>то не нервное напряжение и не равновесие</w:t>
+      </w:r>
+      <w:r>
+        <w:rPr>
+          <w:rFonts w:ascii="Times New Roman" w:hAnsi="Times New Roman" w:cs="Times New Roman"/>
+          <w:sz w:val="24"/>
+          <w:szCs w:val="24"/>
+          <w:lang w:val="ru-RU"/>
+        </w:rPr>
+        <w:t>.</w:t>
+      </w:r>
+      <w:r>
+        <w:rPr>
+          <w:rFonts w:ascii="Times New Roman" w:hAnsi="Times New Roman" w:cs="Times New Roman"/>
+          <w:sz w:val="24"/>
+          <w:szCs w:val="24"/>
+          <w:lang w:val="ru-RU"/>
+        </w:rPr>
+        <w:t xml:space="preserve"> Это скорее бодрость, концентрация сил. Это некоторая величина, у которой есть значение: </w:t>
+      </w:r>
+      <w:proofErr w:type="spellStart"/>
+      <w:r>
+        <w:rPr>
+          <w:rFonts w:ascii="Times New Roman" w:hAnsi="Times New Roman" w:cs="Times New Roman"/>
           <w:i/>
-          <w:lang w:val="ru-RU"/>
-        </w:rPr>
-        <w:t>сродство</w:t>
-      </w:r>
-      <w:r>
-        <w:rPr>
-          <w:lang w:val="ru-RU"/>
-        </w:rPr>
-        <w:t>.</w:t>
+          <w:iCs/>
+          <w:sz w:val="24"/>
+          <w:szCs w:val="24"/>
+          <w:lang w:val="ru-RU"/>
+        </w:rPr>
+        <w:t>тоноса</w:t>
+      </w:r>
+      <w:proofErr w:type="spellEnd"/>
+      <w:r>
+        <w:rPr>
+          <w:rFonts w:ascii="Times New Roman" w:hAnsi="Times New Roman" w:cs="Times New Roman"/>
+          <w:sz w:val="24"/>
+          <w:szCs w:val="24"/>
+          <w:lang w:val="ru-RU"/>
+        </w:rPr>
+        <w:t xml:space="preserve"> может быть больше или меньше</w:t>
+      </w:r>
+      <w:r>
+        <w:rPr>
+          <w:rFonts w:ascii="Times New Roman" w:hAnsi="Times New Roman" w:cs="Times New Roman"/>
+          <w:sz w:val="24"/>
+          <w:szCs w:val="24"/>
+          <w:lang w:val="ru-RU"/>
+        </w:rPr>
+        <w:t>;</w:t>
+      </w:r>
+      <w:r>
+        <w:rPr>
+          <w:rFonts w:ascii="Times New Roman" w:hAnsi="Times New Roman" w:cs="Times New Roman"/>
+          <w:sz w:val="24"/>
+          <w:szCs w:val="24"/>
+          <w:lang w:val="ru-RU"/>
+        </w:rPr>
+        <w:t xml:space="preserve"> он неделим, но изменяется с течением времени. Любое понятие страсти (боль, удовольствие) появляется при </w:t>
+      </w:r>
+      <w:r>
+        <w:rPr>
+          <w:rFonts w:ascii="Times New Roman" w:hAnsi="Times New Roman" w:cs="Times New Roman"/>
+          <w:i/>
+          <w:iCs/>
+          <w:sz w:val="24"/>
+          <w:szCs w:val="24"/>
+          <w:lang w:val="ru-RU"/>
+        </w:rPr>
+        <w:t>развертке</w:t>
+      </w:r>
+      <w:r>
+        <w:rPr>
+          <w:rFonts w:ascii="Times New Roman" w:hAnsi="Times New Roman" w:cs="Times New Roman"/>
+          <w:sz w:val="24"/>
+          <w:szCs w:val="24"/>
+          <w:lang w:val="ru-RU"/>
+        </w:rPr>
+        <w:t xml:space="preserve"> (создании топологической модели), объединении нескольких состояний сразу. Сущность, которая может иметь разные значения </w:t>
+      </w:r>
+      <w:proofErr w:type="spellStart"/>
+      <w:r>
+        <w:rPr>
+          <w:rFonts w:ascii="Times New Roman" w:hAnsi="Times New Roman" w:cs="Times New Roman"/>
+          <w:i/>
+          <w:iCs/>
+          <w:sz w:val="24"/>
+          <w:szCs w:val="24"/>
+          <w:lang w:val="ru-RU"/>
+        </w:rPr>
+        <w:t>тоноса</w:t>
+      </w:r>
+      <w:proofErr w:type="spellEnd"/>
+      <w:r>
+        <w:rPr>
+          <w:rFonts w:ascii="Times New Roman" w:hAnsi="Times New Roman" w:cs="Times New Roman"/>
+          <w:sz w:val="24"/>
+          <w:szCs w:val="24"/>
+          <w:lang w:val="ru-RU"/>
+        </w:rPr>
+        <w:t xml:space="preserve"> — </w:t>
+      </w:r>
+      <w:r>
+        <w:rPr>
+          <w:rFonts w:ascii="Times New Roman" w:hAnsi="Times New Roman" w:cs="Times New Roman"/>
+          <w:sz w:val="24"/>
+          <w:szCs w:val="24"/>
+          <w:lang w:val="ru-RU"/>
+        </w:rPr>
+        <w:t>π</w:t>
+      </w:r>
+      <w:proofErr w:type="spellStart"/>
+      <w:r>
+        <w:rPr>
+          <w:rFonts w:ascii="Times New Roman" w:hAnsi="Times New Roman" w:cs="Times New Roman"/>
+          <w:sz w:val="24"/>
+          <w:szCs w:val="24"/>
+          <w:lang w:val="ru-RU"/>
+        </w:rPr>
+        <w:t>νεῦμ</w:t>
+      </w:r>
+      <w:proofErr w:type="spellEnd"/>
+      <w:r>
+        <w:rPr>
+          <w:rFonts w:ascii="Times New Roman" w:hAnsi="Times New Roman" w:cs="Times New Roman"/>
+          <w:sz w:val="24"/>
+          <w:szCs w:val="24"/>
+          <w:lang w:val="ru-RU"/>
+        </w:rPr>
+        <w:t>α</w:t>
+      </w:r>
+      <w:r>
+        <w:rPr>
+          <w:rFonts w:ascii="Times New Roman" w:hAnsi="Times New Roman" w:cs="Times New Roman"/>
+          <w:sz w:val="24"/>
+          <w:szCs w:val="24"/>
+          <w:lang w:val="ru-RU"/>
+        </w:rPr>
+        <w:t xml:space="preserve"> [</w:t>
+      </w:r>
+      <w:proofErr w:type="spellStart"/>
+      <w:r>
+        <w:rPr>
+          <w:rFonts w:ascii="Times New Roman" w:hAnsi="Times New Roman" w:cs="Times New Roman"/>
+          <w:b/>
+          <w:i/>
+          <w:sz w:val="24"/>
+          <w:szCs w:val="24"/>
+          <w:lang w:val="ru-RU"/>
+        </w:rPr>
+        <w:t>пневма</w:t>
+      </w:r>
+      <w:proofErr w:type="spellEnd"/>
+      <w:r>
+        <w:rPr>
+          <w:rFonts w:ascii="Times New Roman" w:hAnsi="Times New Roman" w:cs="Times New Roman"/>
+          <w:bCs/>
+          <w:iCs/>
+          <w:sz w:val="24"/>
+          <w:szCs w:val="24"/>
+          <w:lang w:val="ru-RU"/>
+        </w:rPr>
+        <w:t>]</w:t>
+      </w:r>
+      <w:r>
+        <w:rPr>
+          <w:rFonts w:ascii="Times New Roman" w:hAnsi="Times New Roman" w:cs="Times New Roman"/>
+          <w:sz w:val="24"/>
+          <w:szCs w:val="24"/>
+          <w:lang w:val="ru-RU"/>
+        </w:rPr>
+        <w:t xml:space="preserve"> </w:t>
+      </w:r>
+      <w:r>
+        <w:rPr>
+          <w:rFonts w:ascii="Times New Roman" w:hAnsi="Times New Roman" w:cs="Times New Roman"/>
+          <w:sz w:val="24"/>
+          <w:szCs w:val="24"/>
+          <w:lang w:val="ru-RU"/>
+        </w:rPr>
+        <w:t xml:space="preserve">— </w:t>
+      </w:r>
+      <w:r>
+        <w:rPr>
+          <w:rFonts w:ascii="Times New Roman" w:hAnsi="Times New Roman" w:cs="Times New Roman"/>
+          <w:sz w:val="24"/>
+          <w:szCs w:val="24"/>
+          <w:lang w:val="ru-RU"/>
+        </w:rPr>
+        <w:t>ветер, дуновение, дыхание.</w:t>
       </w:r>
     </w:p>
     <w:p>
       <w:pPr>
+        <w:pStyle w:val="Heading2"/>
         <w:rPr>
           <w:lang w:val="ru-RU"/>
         </w:rPr>
       </w:pPr>
       <w:r>
         <w:rPr>
-          <w:b/>
-          <w:lang w:val="ru-RU"/>
-        </w:rPr>
-        <w:t>Катеконта</w:t>
-      </w:r>
-      <w:r>
-        <w:rPr>
-          <w:lang w:val="ru-RU"/>
-        </w:rPr>
-        <w:t xml:space="preserve"> (должное, надлежащее). Пыль движется только в должном направлении. К движущейся колеснице прикованы два человека: один сопротивляется движению, другой следует за колесницей. Второй человек совершает должное. Важно! Под должным не имеются в виду какие-либо моральные нормы! Таких норм в принципе нету. Есть только силы, которые на нас действуют: природные, социальные итп. И человек должен не сопротивляться им, а следовать воздействию, которое на меня влияет, чтобы не чувствовать страдание. Стоический мудрец не должен сопротивляться внешним силам, следовать их направлению. Именно такая позиция позволит достичь атараксии.</w:t>
-      </w:r>
+          <w:lang w:val="ru-RU"/>
+        </w:rPr>
+        <w:t xml:space="preserve">Больше о </w:t>
+      </w:r>
+      <w:proofErr w:type="spellStart"/>
+      <w:r>
+        <w:rPr>
+          <w:lang w:val="ru-RU"/>
+        </w:rPr>
+        <w:t>пневме</w:t>
+      </w:r>
+      <w:proofErr w:type="spellEnd"/>
     </w:p>
     <w:p>
       <w:pPr>
         <w:rPr>
+          <w:rFonts w:ascii="Times New Roman" w:hAnsi="Times New Roman" w:cs="Times New Roman"/>
+          <w:sz w:val="24"/>
+          <w:szCs w:val="24"/>
           <w:lang w:val="ru-RU"/>
         </w:rPr>
       </w:pPr>
       <w:r>
         <w:rPr>
-          <w:lang w:val="ru-RU"/>
-        </w:rPr>
-        <w:t>Одна из проблем стоиков в том, что если достичь этого состояния так легко, то почему никто не следует стоицизму?</w:t>
+          <w:rFonts w:ascii="Times New Roman" w:hAnsi="Times New Roman" w:cs="Times New Roman"/>
+          <w:sz w:val="24"/>
+          <w:szCs w:val="24"/>
+          <w:lang w:val="ru-RU"/>
+        </w:rPr>
+        <w:t>Именно благодаря ей существуют мышление, восприятие</w:t>
+      </w:r>
+      <w:r>
+        <w:rPr>
+          <w:rFonts w:ascii="Times New Roman" w:hAnsi="Times New Roman" w:cs="Times New Roman"/>
+          <w:sz w:val="24"/>
+          <w:szCs w:val="24"/>
+          <w:lang w:val="ru-RU"/>
+        </w:rPr>
+        <w:t xml:space="preserve"> </w:t>
+      </w:r>
+      <w:r>
+        <w:rPr>
+          <w:rFonts w:ascii="Times New Roman" w:hAnsi="Times New Roman" w:cs="Times New Roman"/>
+          <w:sz w:val="24"/>
+          <w:szCs w:val="24"/>
+          <w:lang w:val="ru-RU"/>
+        </w:rPr>
+        <w:t>и</w:t>
+      </w:r>
+      <w:r>
+        <w:rPr>
+          <w:rFonts w:ascii="Times New Roman" w:hAnsi="Times New Roman" w:cs="Times New Roman"/>
+          <w:sz w:val="24"/>
+          <w:szCs w:val="24"/>
+          <w:lang w:val="ru-RU"/>
+        </w:rPr>
+        <w:t xml:space="preserve"> сознание. </w:t>
+      </w:r>
+      <w:proofErr w:type="spellStart"/>
+      <w:r>
+        <w:rPr>
+          <w:rFonts w:ascii="Times New Roman" w:hAnsi="Times New Roman" w:cs="Times New Roman"/>
+          <w:i/>
+          <w:iCs/>
+          <w:sz w:val="24"/>
+          <w:szCs w:val="24"/>
+          <w:lang w:val="ru-RU"/>
+        </w:rPr>
+        <w:t>Пневма</w:t>
+      </w:r>
+      <w:proofErr w:type="spellEnd"/>
+      <w:r>
+        <w:rPr>
+          <w:rFonts w:ascii="Times New Roman" w:hAnsi="Times New Roman" w:cs="Times New Roman"/>
+          <w:sz w:val="24"/>
+          <w:szCs w:val="24"/>
+          <w:lang w:val="ru-RU"/>
+        </w:rPr>
+        <w:t xml:space="preserve"> — это </w:t>
+      </w:r>
+      <w:r>
+        <w:rPr>
+          <w:rFonts w:ascii="Times New Roman" w:hAnsi="Times New Roman" w:cs="Times New Roman"/>
+          <w:sz w:val="24"/>
+          <w:szCs w:val="24"/>
+          <w:u w:val="single"/>
+          <w:lang w:val="ru-RU"/>
+        </w:rPr>
+        <w:t xml:space="preserve">то, </w:t>
+      </w:r>
+      <w:r>
+        <w:rPr>
+          <w:rFonts w:ascii="Times New Roman" w:hAnsi="Times New Roman" w:cs="Times New Roman"/>
+          <w:iCs/>
+          <w:sz w:val="24"/>
+          <w:szCs w:val="24"/>
+          <w:u w:val="single"/>
+          <w:lang w:val="ru-RU"/>
+        </w:rPr>
+        <w:t>что</w:t>
+      </w:r>
+      <w:r>
+        <w:rPr>
+          <w:rFonts w:ascii="Times New Roman" w:hAnsi="Times New Roman" w:cs="Times New Roman"/>
+          <w:sz w:val="24"/>
+          <w:szCs w:val="24"/>
+          <w:u w:val="single"/>
+          <w:lang w:val="ru-RU"/>
+        </w:rPr>
+        <w:t xml:space="preserve"> переживает</w:t>
+      </w:r>
+      <w:r>
+        <w:rPr>
+          <w:rFonts w:ascii="Times New Roman" w:hAnsi="Times New Roman" w:cs="Times New Roman"/>
+          <w:sz w:val="24"/>
+          <w:szCs w:val="24"/>
+          <w:lang w:val="ru-RU"/>
+        </w:rPr>
+        <w:t xml:space="preserve">. Человек это и есть </w:t>
+      </w:r>
+      <w:proofErr w:type="spellStart"/>
+      <w:r>
+        <w:rPr>
+          <w:rFonts w:ascii="Times New Roman" w:hAnsi="Times New Roman" w:cs="Times New Roman"/>
+          <w:i/>
+          <w:iCs/>
+          <w:sz w:val="24"/>
+          <w:szCs w:val="24"/>
+          <w:lang w:val="ru-RU"/>
+        </w:rPr>
+        <w:t>пневма</w:t>
+      </w:r>
+      <w:proofErr w:type="spellEnd"/>
+      <w:r>
+        <w:rPr>
+          <w:rFonts w:ascii="Times New Roman" w:hAnsi="Times New Roman" w:cs="Times New Roman"/>
+          <w:sz w:val="24"/>
+          <w:szCs w:val="24"/>
+          <w:lang w:val="ru-RU"/>
+        </w:rPr>
+        <w:t xml:space="preserve">. </w:t>
+      </w:r>
+      <w:r>
+        <w:rPr>
+          <w:rFonts w:ascii="Times New Roman" w:hAnsi="Times New Roman" w:cs="Times New Roman"/>
+          <w:sz w:val="24"/>
+          <w:szCs w:val="24"/>
+          <w:lang w:val="ru-RU"/>
+        </w:rPr>
+        <w:t>Все наши воспоминания — это</w:t>
+      </w:r>
+      <w:r>
+        <w:rPr>
+          <w:rFonts w:ascii="Times New Roman" w:hAnsi="Times New Roman" w:cs="Times New Roman"/>
+          <w:sz w:val="24"/>
+          <w:szCs w:val="24"/>
+          <w:lang w:val="ru-RU"/>
+        </w:rPr>
+        <w:t xml:space="preserve"> проявления </w:t>
+      </w:r>
+      <w:proofErr w:type="spellStart"/>
+      <w:r>
+        <w:rPr>
+          <w:rFonts w:ascii="Times New Roman" w:hAnsi="Times New Roman" w:cs="Times New Roman"/>
+          <w:i/>
+          <w:iCs/>
+          <w:sz w:val="24"/>
+          <w:szCs w:val="24"/>
+          <w:lang w:val="ru-RU"/>
+        </w:rPr>
+        <w:t>пневмы</w:t>
+      </w:r>
+      <w:proofErr w:type="spellEnd"/>
+      <w:r>
+        <w:rPr>
+          <w:rFonts w:ascii="Times New Roman" w:hAnsi="Times New Roman" w:cs="Times New Roman"/>
+          <w:sz w:val="24"/>
+          <w:szCs w:val="24"/>
+          <w:lang w:val="ru-RU"/>
+        </w:rPr>
+        <w:t xml:space="preserve">. Человек отличается от животного более высоким уровнем интенсивности </w:t>
+      </w:r>
+      <w:proofErr w:type="spellStart"/>
+      <w:r>
+        <w:rPr>
+          <w:rFonts w:ascii="Times New Roman" w:hAnsi="Times New Roman" w:cs="Times New Roman"/>
+          <w:i/>
+          <w:iCs/>
+          <w:sz w:val="24"/>
+          <w:szCs w:val="24"/>
+          <w:lang w:val="ru-RU"/>
+        </w:rPr>
+        <w:t>пневмы</w:t>
+      </w:r>
+      <w:proofErr w:type="spellEnd"/>
+      <w:r>
+        <w:rPr>
+          <w:rFonts w:ascii="Times New Roman" w:hAnsi="Times New Roman" w:cs="Times New Roman"/>
+          <w:sz w:val="24"/>
+          <w:szCs w:val="24"/>
+          <w:lang w:val="ru-RU"/>
+        </w:rPr>
+        <w:t xml:space="preserve">, потому что человек способен на большее количество вещей. В нем </w:t>
+      </w:r>
+      <w:proofErr w:type="spellStart"/>
+      <w:r>
+        <w:rPr>
+          <w:rFonts w:ascii="Times New Roman" w:hAnsi="Times New Roman" w:cs="Times New Roman"/>
+          <w:sz w:val="24"/>
+          <w:szCs w:val="24"/>
+          <w:lang w:val="ru-RU"/>
+        </w:rPr>
+        <w:t>пневма</w:t>
+      </w:r>
+      <w:proofErr w:type="spellEnd"/>
+      <w:r>
+        <w:rPr>
+          <w:rFonts w:ascii="Times New Roman" w:hAnsi="Times New Roman" w:cs="Times New Roman"/>
+          <w:sz w:val="24"/>
+          <w:szCs w:val="24"/>
+          <w:lang w:val="ru-RU"/>
+        </w:rPr>
+        <w:t xml:space="preserve"> проявляет себя более активно. Но </w:t>
+      </w:r>
+      <w:proofErr w:type="spellStart"/>
+      <w:r>
+        <w:rPr>
+          <w:rFonts w:ascii="Times New Roman" w:hAnsi="Times New Roman" w:cs="Times New Roman"/>
+          <w:i/>
+          <w:iCs/>
+          <w:sz w:val="24"/>
+          <w:szCs w:val="24"/>
+          <w:lang w:val="ru-RU"/>
+        </w:rPr>
+        <w:t>пневма</w:t>
+      </w:r>
+      <w:proofErr w:type="spellEnd"/>
+      <w:r>
+        <w:rPr>
+          <w:rFonts w:ascii="Times New Roman" w:hAnsi="Times New Roman" w:cs="Times New Roman"/>
+          <w:sz w:val="24"/>
+          <w:szCs w:val="24"/>
+          <w:lang w:val="ru-RU"/>
+        </w:rPr>
+        <w:t xml:space="preserve"> проявляется не только в мышлении или сознании.</w:t>
       </w:r>
     </w:p>
     <w:p>
       <w:pPr>
         <w:rPr>
+          <w:rFonts w:ascii="Times New Roman" w:hAnsi="Times New Roman" w:cs="Times New Roman"/>
+          <w:sz w:val="24"/>
+          <w:szCs w:val="24"/>
+          <w:lang w:val="ru-RU"/>
+        </w:rPr>
+      </w:pPr>
+      <w:r>
+        <w:rPr>
+          <w:rFonts w:ascii="Times New Roman" w:hAnsi="Times New Roman" w:cs="Times New Roman"/>
+          <w:sz w:val="24"/>
+          <w:szCs w:val="24"/>
+          <w:lang w:val="ru-RU"/>
+        </w:rPr>
+        <w:t xml:space="preserve">Почему </w:t>
+      </w:r>
+      <w:proofErr w:type="spellStart"/>
+      <w:r>
+        <w:rPr>
+          <w:rFonts w:ascii="Times New Roman" w:hAnsi="Times New Roman" w:cs="Times New Roman"/>
+          <w:i/>
+          <w:iCs/>
+          <w:sz w:val="24"/>
+          <w:szCs w:val="24"/>
+          <w:lang w:val="ru-RU"/>
+        </w:rPr>
+        <w:t>пневма</w:t>
+      </w:r>
+      <w:proofErr w:type="spellEnd"/>
+      <w:r>
+        <w:rPr>
+          <w:rFonts w:ascii="Times New Roman" w:hAnsi="Times New Roman" w:cs="Times New Roman"/>
+          <w:sz w:val="24"/>
+          <w:szCs w:val="24"/>
+          <w:lang w:val="ru-RU"/>
+        </w:rPr>
+        <w:t xml:space="preserve"> является условием свободы воли? Почему </w:t>
+      </w:r>
+      <w:proofErr w:type="spellStart"/>
+      <w:r>
+        <w:rPr>
+          <w:rFonts w:ascii="Times New Roman" w:hAnsi="Times New Roman" w:cs="Times New Roman"/>
+          <w:sz w:val="24"/>
+          <w:szCs w:val="24"/>
+          <w:lang w:val="ru-RU"/>
+        </w:rPr>
+        <w:t>пневма</w:t>
+      </w:r>
+      <w:proofErr w:type="spellEnd"/>
+      <w:r>
+        <w:rPr>
+          <w:rFonts w:ascii="Times New Roman" w:hAnsi="Times New Roman" w:cs="Times New Roman"/>
+          <w:sz w:val="24"/>
+          <w:szCs w:val="24"/>
+          <w:lang w:val="ru-RU"/>
+        </w:rPr>
+        <w:t xml:space="preserve"> является характеристикой свободы воли? Каковы условия физической реальности, которая обеспечивает нашу свободу воли?</w:t>
+      </w:r>
+    </w:p>
+    <w:p>
+      <w:pPr>
+        <w:rPr>
+          <w:rFonts w:ascii="Times New Roman" w:hAnsi="Times New Roman" w:cs="Times New Roman"/>
+          <w:sz w:val="24"/>
+          <w:szCs w:val="24"/>
+          <w:lang w:val="ru-RU"/>
+        </w:rPr>
+      </w:pPr>
+      <w:r>
+        <w:rPr>
+          <w:rFonts w:ascii="Times New Roman" w:hAnsi="Times New Roman" w:cs="Times New Roman"/>
+          <w:sz w:val="24"/>
+          <w:szCs w:val="24"/>
+          <w:lang w:val="ru-RU"/>
+        </w:rPr>
+        <w:t>Так или иначе, человек существует среди протяженных материальных тел, которые являются разверткой. Для этих тел у стоиков есть понятие —</w:t>
+      </w:r>
+      <w:r>
+        <w:rPr>
+          <w:rFonts w:ascii="Times New Roman" w:hAnsi="Times New Roman" w:cs="Times New Roman"/>
+          <w:sz w:val="24"/>
+          <w:szCs w:val="24"/>
+          <w:lang w:val="ru-RU"/>
+        </w:rPr>
+        <w:t xml:space="preserve"> </w:t>
+      </w:r>
+      <w:proofErr w:type="spellStart"/>
+      <w:r>
+        <w:rPr>
+          <w:rFonts w:ascii="Times New Roman" w:hAnsi="Times New Roman" w:cs="Times New Roman"/>
+          <w:sz w:val="24"/>
+          <w:szCs w:val="24"/>
+          <w:lang w:val="ru-RU"/>
+        </w:rPr>
+        <w:t>ὕλη</w:t>
+      </w:r>
+      <w:proofErr w:type="spellEnd"/>
+      <w:r>
+        <w:rPr>
+          <w:rFonts w:ascii="Times New Roman" w:hAnsi="Times New Roman" w:cs="Times New Roman"/>
+          <w:sz w:val="24"/>
+          <w:szCs w:val="24"/>
+          <w:lang w:val="ru-RU"/>
+        </w:rPr>
+        <w:t xml:space="preserve"> </w:t>
+      </w:r>
+      <w:r>
+        <w:rPr>
+          <w:rFonts w:ascii="Times New Roman" w:hAnsi="Times New Roman" w:cs="Times New Roman"/>
+          <w:sz w:val="24"/>
+          <w:szCs w:val="24"/>
+          <w:lang w:val="ru-RU"/>
+        </w:rPr>
+        <w:t>[</w:t>
+      </w:r>
+      <w:proofErr w:type="spellStart"/>
+      <w:r>
+        <w:rPr>
+          <w:rFonts w:ascii="Times New Roman" w:hAnsi="Times New Roman" w:cs="Times New Roman"/>
+          <w:b/>
+          <w:sz w:val="24"/>
+          <w:szCs w:val="24"/>
+          <w:lang w:val="ru-RU"/>
+        </w:rPr>
+        <w:t>гюле</w:t>
+      </w:r>
+      <w:proofErr w:type="spellEnd"/>
+      <w:r>
+        <w:rPr>
+          <w:rFonts w:ascii="Times New Roman" w:hAnsi="Times New Roman" w:cs="Times New Roman"/>
+          <w:b/>
+          <w:sz w:val="24"/>
+          <w:szCs w:val="24"/>
+          <w:lang w:val="ru-RU"/>
+        </w:rPr>
+        <w:t>]</w:t>
+      </w:r>
+      <w:r>
+        <w:rPr>
+          <w:rFonts w:ascii="Times New Roman" w:hAnsi="Times New Roman" w:cs="Times New Roman"/>
+          <w:sz w:val="24"/>
+          <w:szCs w:val="24"/>
+          <w:lang w:val="ru-RU"/>
+        </w:rPr>
+        <w:t xml:space="preserve"> </w:t>
+      </w:r>
+      <w:r>
+        <w:rPr>
+          <w:rFonts w:ascii="Times New Roman" w:hAnsi="Times New Roman" w:cs="Times New Roman"/>
+          <w:sz w:val="24"/>
+          <w:szCs w:val="24"/>
+          <w:lang w:val="ru-RU"/>
+        </w:rPr>
+        <w:t xml:space="preserve">— </w:t>
+      </w:r>
+      <w:r>
+        <w:rPr>
+          <w:rFonts w:ascii="Times New Roman" w:hAnsi="Times New Roman" w:cs="Times New Roman"/>
+          <w:sz w:val="24"/>
+          <w:szCs w:val="24"/>
+          <w:lang w:val="ru-RU"/>
+        </w:rPr>
+        <w:t xml:space="preserve">материя. Это протяженное, твердое, непроницаемое и мы живем в мире </w:t>
+      </w:r>
+      <w:proofErr w:type="spellStart"/>
+      <w:r>
+        <w:rPr>
+          <w:rFonts w:ascii="Times New Roman" w:hAnsi="Times New Roman" w:cs="Times New Roman"/>
+          <w:i/>
+          <w:iCs/>
+          <w:sz w:val="24"/>
+          <w:szCs w:val="24"/>
+          <w:lang w:val="ru-RU"/>
+        </w:rPr>
+        <w:t>гюле</w:t>
+      </w:r>
+      <w:proofErr w:type="spellEnd"/>
+      <w:r>
+        <w:rPr>
+          <w:rFonts w:ascii="Times New Roman" w:hAnsi="Times New Roman" w:cs="Times New Roman"/>
+          <w:sz w:val="24"/>
+          <w:szCs w:val="24"/>
+          <w:lang w:val="ru-RU"/>
+        </w:rPr>
+        <w:t xml:space="preserve">. Но если бы в мире существовала только </w:t>
+      </w:r>
+      <w:proofErr w:type="spellStart"/>
+      <w:r>
+        <w:rPr>
+          <w:rFonts w:ascii="Times New Roman" w:hAnsi="Times New Roman" w:cs="Times New Roman"/>
+          <w:i/>
+          <w:iCs/>
+          <w:sz w:val="24"/>
+          <w:szCs w:val="24"/>
+          <w:lang w:val="ru-RU"/>
+        </w:rPr>
+        <w:t>гюле</w:t>
+      </w:r>
+      <w:proofErr w:type="spellEnd"/>
+      <w:r>
+        <w:rPr>
+          <w:rFonts w:ascii="Times New Roman" w:hAnsi="Times New Roman" w:cs="Times New Roman"/>
+          <w:sz w:val="24"/>
+          <w:szCs w:val="24"/>
+          <w:lang w:val="ru-RU"/>
+        </w:rPr>
+        <w:t xml:space="preserve">, свободы воли бы не существовало, а была бы только одна твердая, непроницаемая материя. Так что помимо </w:t>
+      </w:r>
+      <w:proofErr w:type="spellStart"/>
+      <w:r>
+        <w:rPr>
+          <w:rFonts w:ascii="Times New Roman" w:hAnsi="Times New Roman" w:cs="Times New Roman"/>
+          <w:i/>
+          <w:iCs/>
+          <w:sz w:val="24"/>
+          <w:szCs w:val="24"/>
+          <w:lang w:val="ru-RU"/>
+        </w:rPr>
+        <w:t>гюле</w:t>
+      </w:r>
+      <w:proofErr w:type="spellEnd"/>
+      <w:r>
+        <w:rPr>
+          <w:rFonts w:ascii="Times New Roman" w:hAnsi="Times New Roman" w:cs="Times New Roman"/>
+          <w:sz w:val="24"/>
+          <w:szCs w:val="24"/>
+          <w:lang w:val="ru-RU"/>
+        </w:rPr>
+        <w:t xml:space="preserve"> существует </w:t>
+      </w:r>
+      <w:proofErr w:type="spellStart"/>
+      <w:r>
+        <w:rPr>
+          <w:rFonts w:ascii="Times New Roman" w:hAnsi="Times New Roman" w:cs="Times New Roman"/>
+          <w:i/>
+          <w:iCs/>
+          <w:sz w:val="24"/>
+          <w:szCs w:val="24"/>
+          <w:lang w:val="ru-RU"/>
+        </w:rPr>
+        <w:t>пневма</w:t>
+      </w:r>
+      <w:proofErr w:type="spellEnd"/>
+      <w:r>
+        <w:rPr>
+          <w:rFonts w:ascii="Times New Roman" w:hAnsi="Times New Roman" w:cs="Times New Roman"/>
+          <w:sz w:val="24"/>
+          <w:szCs w:val="24"/>
+          <w:lang w:val="ru-RU"/>
+        </w:rPr>
+        <w:t xml:space="preserve"> — интенсивная сущность. Она и является условием свободы воли и существует в физической реальности. </w:t>
+      </w:r>
+    </w:p>
+    <w:p>
+      <w:pPr>
+        <w:pStyle w:val="Heading2"/>
+        <w:rPr>
+          <w:lang w:val="ru-RU"/>
+        </w:rPr>
+      </w:pPr>
+      <w:proofErr w:type="spellStart"/>
+      <w:r>
+        <w:rPr>
+          <w:lang w:val="ru-RU"/>
+        </w:rPr>
+        <w:t>Пневма</w:t>
+      </w:r>
+      <w:proofErr w:type="spellEnd"/>
+      <w:r>
+        <w:rPr>
+          <w:lang w:val="ru-RU"/>
+        </w:rPr>
+        <w:t xml:space="preserve"> как поле</w:t>
+      </w:r>
+    </w:p>
+    <w:p>
+      <w:pPr>
+        <w:rPr>
+          <w:rFonts w:ascii="Times New Roman" w:hAnsi="Times New Roman" w:cs="Times New Roman"/>
+          <w:sz w:val="24"/>
+          <w:szCs w:val="24"/>
+          <w:lang w:val="ru-RU"/>
+        </w:rPr>
+      </w:pPr>
+      <w:r>
+        <w:rPr>
+          <w:rFonts w:ascii="Times New Roman" w:hAnsi="Times New Roman" w:cs="Times New Roman"/>
+          <w:sz w:val="24"/>
+          <w:szCs w:val="24"/>
+          <w:lang w:val="ru-RU"/>
+        </w:rPr>
+        <w:t xml:space="preserve">Аналогия </w:t>
+      </w:r>
+      <w:proofErr w:type="spellStart"/>
+      <w:r>
+        <w:rPr>
+          <w:rFonts w:ascii="Times New Roman" w:hAnsi="Times New Roman" w:cs="Times New Roman"/>
+          <w:i/>
+          <w:iCs/>
+          <w:sz w:val="24"/>
+          <w:szCs w:val="24"/>
+          <w:lang w:val="ru-RU"/>
+        </w:rPr>
+        <w:t>пневмы</w:t>
+      </w:r>
+      <w:proofErr w:type="spellEnd"/>
+      <w:r>
+        <w:rPr>
+          <w:rFonts w:ascii="Times New Roman" w:hAnsi="Times New Roman" w:cs="Times New Roman"/>
+          <w:sz w:val="24"/>
+          <w:szCs w:val="24"/>
+          <w:lang w:val="ru-RU"/>
+        </w:rPr>
+        <w:t xml:space="preserve"> для понимания: электромагнитное поле. Понятие эл-м поля долго вымещалось из-за существования другого понятия — </w:t>
+      </w:r>
+      <w:r>
+        <w:rPr>
+          <w:rFonts w:ascii="Times New Roman" w:hAnsi="Times New Roman" w:cs="Times New Roman"/>
+          <w:b/>
+          <w:sz w:val="24"/>
+          <w:szCs w:val="24"/>
+          <w:lang w:val="ru-RU"/>
+        </w:rPr>
+        <w:t>эфир</w:t>
+      </w:r>
+      <w:r>
+        <w:rPr>
+          <w:rFonts w:ascii="Times New Roman" w:hAnsi="Times New Roman" w:cs="Times New Roman"/>
+          <w:b/>
+          <w:sz w:val="24"/>
+          <w:szCs w:val="24"/>
+          <w:lang w:val="ru-RU"/>
+        </w:rPr>
+        <w:t>а</w:t>
+      </w:r>
+      <w:r>
+        <w:rPr>
+          <w:rFonts w:ascii="Times New Roman" w:hAnsi="Times New Roman" w:cs="Times New Roman"/>
+          <w:sz w:val="24"/>
+          <w:szCs w:val="24"/>
+          <w:lang w:val="ru-RU"/>
+        </w:rPr>
+        <w:t xml:space="preserve">. В классической механике, где существует только материальное вещество, когда все может мыслиться только топологически. Поэтому в одном месте не может одновременно находиться несколько тел. Эфир же был средой, в которой существуют материальные тела. Это — очень тонкая материя. Эфир не может проникать внутрь тела. Он окутывает тела. Но впоследствии опыта, который показал, что эфира не существует, было высказано предположение о том, что существует физическая сущность, живущая по другим законам, и что может быть в одном и том же месте с материей. Стоики же задолго до какой-либо науки выдвинули теорию «тотального смешения», в которой предполагали, что в одном месте </w:t>
+      </w:r>
+      <w:r>
+        <w:rPr>
+          <w:rFonts w:ascii="Times New Roman" w:hAnsi="Times New Roman" w:cs="Times New Roman"/>
+          <w:i/>
+          <w:sz w:val="24"/>
+          <w:szCs w:val="24"/>
+          <w:lang w:val="ru-RU"/>
+        </w:rPr>
+        <w:t>может</w:t>
+      </w:r>
+      <w:r>
+        <w:rPr>
+          <w:rFonts w:ascii="Times New Roman" w:hAnsi="Times New Roman" w:cs="Times New Roman"/>
+          <w:sz w:val="24"/>
+          <w:szCs w:val="24"/>
+          <w:lang w:val="ru-RU"/>
+        </w:rPr>
+        <w:t xml:space="preserve"> существовать несколько физических сущностей. Одна из сущностей как бы полностью проникает в материальные тела (</w:t>
+      </w:r>
+      <w:proofErr w:type="spellStart"/>
+      <w:r>
+        <w:rPr>
+          <w:rFonts w:ascii="Times New Roman" w:hAnsi="Times New Roman" w:cs="Times New Roman"/>
+          <w:i/>
+          <w:iCs/>
+          <w:sz w:val="24"/>
+          <w:szCs w:val="24"/>
+          <w:lang w:val="ru-RU"/>
+        </w:rPr>
+        <w:t>гюле</w:t>
+      </w:r>
+      <w:proofErr w:type="spellEnd"/>
+      <w:r>
+        <w:rPr>
+          <w:rFonts w:ascii="Times New Roman" w:hAnsi="Times New Roman" w:cs="Times New Roman"/>
+          <w:sz w:val="24"/>
+          <w:szCs w:val="24"/>
+          <w:lang w:val="ru-RU"/>
+        </w:rPr>
+        <w:t xml:space="preserve">). Эта сущность и есть </w:t>
+      </w:r>
+      <w:proofErr w:type="spellStart"/>
+      <w:r>
+        <w:rPr>
+          <w:rFonts w:ascii="Times New Roman" w:hAnsi="Times New Roman" w:cs="Times New Roman"/>
+          <w:i/>
+          <w:iCs/>
+          <w:sz w:val="24"/>
+          <w:szCs w:val="24"/>
+          <w:lang w:val="ru-RU"/>
+        </w:rPr>
+        <w:t>пневма</w:t>
+      </w:r>
+      <w:proofErr w:type="spellEnd"/>
+      <w:r>
+        <w:rPr>
+          <w:rFonts w:ascii="Times New Roman" w:hAnsi="Times New Roman" w:cs="Times New Roman"/>
+          <w:sz w:val="24"/>
+          <w:szCs w:val="24"/>
+          <w:lang w:val="ru-RU"/>
+        </w:rPr>
+        <w:t xml:space="preserve">. Одновременное сосуществование </w:t>
+      </w:r>
+      <w:proofErr w:type="spellStart"/>
+      <w:r>
+        <w:rPr>
+          <w:rFonts w:ascii="Times New Roman" w:hAnsi="Times New Roman" w:cs="Times New Roman"/>
+          <w:i/>
+          <w:iCs/>
+          <w:sz w:val="24"/>
+          <w:szCs w:val="24"/>
+          <w:lang w:val="ru-RU"/>
+        </w:rPr>
+        <w:t>пневмы</w:t>
+      </w:r>
+      <w:proofErr w:type="spellEnd"/>
+      <w:r>
+        <w:rPr>
+          <w:rFonts w:ascii="Times New Roman" w:hAnsi="Times New Roman" w:cs="Times New Roman"/>
+          <w:sz w:val="24"/>
+          <w:szCs w:val="24"/>
+          <w:lang w:val="ru-RU"/>
+        </w:rPr>
+        <w:t xml:space="preserve"> и </w:t>
+      </w:r>
+      <w:proofErr w:type="spellStart"/>
+      <w:r>
+        <w:rPr>
+          <w:rFonts w:ascii="Times New Roman" w:hAnsi="Times New Roman" w:cs="Times New Roman"/>
+          <w:i/>
+          <w:iCs/>
+          <w:sz w:val="24"/>
+          <w:szCs w:val="24"/>
+          <w:lang w:val="ru-RU"/>
+        </w:rPr>
+        <w:t>гюле</w:t>
+      </w:r>
+      <w:proofErr w:type="spellEnd"/>
+      <w:r>
+        <w:rPr>
+          <w:rFonts w:ascii="Times New Roman" w:hAnsi="Times New Roman" w:cs="Times New Roman"/>
+          <w:sz w:val="24"/>
+          <w:szCs w:val="24"/>
+          <w:lang w:val="ru-RU"/>
+        </w:rPr>
+        <w:t xml:space="preserve"> в момент настоящего — это и есть свобода воли. Свобода воли определяется некоторым значением </w:t>
+      </w:r>
+      <w:proofErr w:type="spellStart"/>
+      <w:r>
+        <w:rPr>
+          <w:rFonts w:ascii="Times New Roman" w:hAnsi="Times New Roman" w:cs="Times New Roman"/>
+          <w:i/>
+          <w:iCs/>
+          <w:sz w:val="24"/>
+          <w:szCs w:val="24"/>
+          <w:lang w:val="ru-RU"/>
+        </w:rPr>
+        <w:t>пневмы</w:t>
+      </w:r>
+      <w:proofErr w:type="spellEnd"/>
+      <w:r>
+        <w:rPr>
+          <w:rFonts w:ascii="Times New Roman" w:hAnsi="Times New Roman" w:cs="Times New Roman"/>
+          <w:sz w:val="24"/>
+          <w:szCs w:val="24"/>
+          <w:lang w:val="ru-RU"/>
+        </w:rPr>
+        <w:t>.</w:t>
+      </w:r>
+    </w:p>
+    <w:p>
+      <w:pPr>
+        <w:rPr>
+          <w:rFonts w:ascii="Times New Roman" w:hAnsi="Times New Roman" w:cs="Times New Roman"/>
+          <w:sz w:val="24"/>
+          <w:szCs w:val="24"/>
+        </w:rPr>
+      </w:pPr>
+      <w:r>
+        <w:rPr>
+          <w:rFonts w:ascii="Times New Roman" w:hAnsi="Times New Roman" w:cs="Times New Roman"/>
+          <w:sz w:val="24"/>
+          <w:szCs w:val="24"/>
+          <w:lang w:val="ru-RU"/>
+        </w:rPr>
+        <w:t>Важно понимать, что р</w:t>
+      </w:r>
+      <w:r>
+        <w:rPr>
+          <w:rFonts w:ascii="Times New Roman" w:hAnsi="Times New Roman" w:cs="Times New Roman"/>
+          <w:sz w:val="24"/>
+          <w:szCs w:val="24"/>
+          <w:lang w:val="ru-RU"/>
+        </w:rPr>
+        <w:t>ечь идёт именно о той свободе воли, которая связана с выбором того, подчиняться мне страстям или нет</w:t>
+      </w:r>
+      <w:r>
+        <w:rPr>
+          <w:rFonts w:ascii="Times New Roman" w:hAnsi="Times New Roman" w:cs="Times New Roman"/>
+          <w:sz w:val="24"/>
+          <w:szCs w:val="24"/>
+          <w:lang w:val="ru-RU"/>
+        </w:rPr>
+        <w:t>;</w:t>
+      </w:r>
+      <w:r>
+        <w:rPr>
+          <w:rFonts w:ascii="Times New Roman" w:hAnsi="Times New Roman" w:cs="Times New Roman"/>
+          <w:sz w:val="24"/>
+          <w:szCs w:val="24"/>
+          <w:lang w:val="ru-RU"/>
+        </w:rPr>
+        <w:t xml:space="preserve"> про поступки и решения, которые существуют как продукт </w:t>
+      </w:r>
+      <w:r>
+        <w:rPr>
+          <w:rFonts w:ascii="Times New Roman" w:hAnsi="Times New Roman" w:cs="Times New Roman"/>
+          <w:i/>
+          <w:iCs/>
+          <w:sz w:val="24"/>
+          <w:szCs w:val="24"/>
+          <w:lang w:val="ru-RU"/>
+        </w:rPr>
+        <w:t>развертки</w:t>
+      </w:r>
+      <w:r>
+        <w:rPr>
+          <w:rFonts w:ascii="Times New Roman" w:hAnsi="Times New Roman" w:cs="Times New Roman"/>
+          <w:sz w:val="24"/>
+          <w:szCs w:val="24"/>
+          <w:lang w:val="ru-RU"/>
+        </w:rPr>
+        <w:t xml:space="preserve">, речи не идёт. Лучше в этом смысле свободу воли называть </w:t>
+      </w:r>
+      <w:r>
+        <w:rPr>
+          <w:rFonts w:ascii="Times New Roman" w:hAnsi="Times New Roman" w:cs="Times New Roman"/>
+          <w:sz w:val="24"/>
+          <w:szCs w:val="24"/>
+          <w:lang w:val="ru-RU"/>
+        </w:rPr>
+        <w:lastRenderedPageBreak/>
+        <w:t>свободой суждения. Свобода воли в обычном её понимании, как автономия по принятию решений, касается христианства</w:t>
+      </w:r>
+      <w:r>
+        <w:rPr>
+          <w:rFonts w:ascii="Times New Roman" w:hAnsi="Times New Roman" w:cs="Times New Roman"/>
+          <w:sz w:val="24"/>
+          <w:szCs w:val="24"/>
+          <w:lang w:val="ru-RU"/>
+        </w:rPr>
+        <w:t xml:space="preserve"> и не затрагивается этиками</w:t>
+      </w:r>
+      <w:r>
+        <w:rPr>
+          <w:rFonts w:ascii="Times New Roman" w:hAnsi="Times New Roman" w:cs="Times New Roman"/>
+          <w:sz w:val="24"/>
+          <w:szCs w:val="24"/>
+          <w:lang w:val="ru-RU"/>
+        </w:rPr>
+        <w:t>.</w:t>
+      </w:r>
+    </w:p>
+    <w:p>
+      <w:pPr>
+        <w:pStyle w:val="Heading2"/>
+        <w:rPr>
+          <w:lang w:val="ru-RU"/>
+        </w:rPr>
+      </w:pPr>
+      <w:r>
+        <w:rPr>
+          <w:lang w:val="ru-RU"/>
+        </w:rPr>
+        <w:t>О должном</w:t>
+      </w:r>
+    </w:p>
+    <w:p>
+      <w:pPr>
+        <w:rPr>
+          <w:rFonts w:ascii="Times New Roman" w:hAnsi="Times New Roman" w:cs="Times New Roman"/>
+          <w:sz w:val="24"/>
+          <w:szCs w:val="24"/>
+          <w:lang w:val="ru-RU"/>
+        </w:rPr>
+      </w:pPr>
+      <w:r>
+        <w:rPr>
+          <w:rFonts w:ascii="Times New Roman" w:hAnsi="Times New Roman" w:cs="Times New Roman"/>
+          <w:sz w:val="24"/>
+          <w:szCs w:val="24"/>
+          <w:lang w:val="ru-RU"/>
+        </w:rPr>
+        <w:t>Для объяснения должного в</w:t>
+      </w:r>
+      <w:r>
+        <w:rPr>
+          <w:rFonts w:ascii="Times New Roman" w:hAnsi="Times New Roman" w:cs="Times New Roman"/>
+          <w:sz w:val="24"/>
+          <w:szCs w:val="24"/>
+          <w:lang w:val="ru-RU"/>
+        </w:rPr>
+        <w:t xml:space="preserve">озьмем человека и сравним его с гравитационной пылью в космосе. Если рассматривать его как целостность, как результат развертки, то различия будут огромны. Но если взять их в момент настоящего, как </w:t>
+      </w:r>
+      <w:proofErr w:type="spellStart"/>
+      <w:r>
+        <w:rPr>
+          <w:rFonts w:ascii="Times New Roman" w:hAnsi="Times New Roman" w:cs="Times New Roman"/>
+          <w:i/>
+          <w:iCs/>
+          <w:sz w:val="24"/>
+          <w:szCs w:val="24"/>
+          <w:lang w:val="ru-RU"/>
+        </w:rPr>
+        <w:t>пневму</w:t>
+      </w:r>
+      <w:proofErr w:type="spellEnd"/>
+      <w:r>
+        <w:rPr>
+          <w:rFonts w:ascii="Times New Roman" w:hAnsi="Times New Roman" w:cs="Times New Roman"/>
+          <w:sz w:val="24"/>
+          <w:szCs w:val="24"/>
+          <w:lang w:val="ru-RU"/>
+        </w:rPr>
+        <w:t xml:space="preserve"> в </w:t>
+      </w:r>
+      <w:proofErr w:type="spellStart"/>
+      <w:r>
+        <w:rPr>
+          <w:rFonts w:ascii="Times New Roman" w:hAnsi="Times New Roman" w:cs="Times New Roman"/>
+          <w:i/>
+          <w:iCs/>
+          <w:sz w:val="24"/>
+          <w:szCs w:val="24"/>
+          <w:lang w:val="ru-RU"/>
+        </w:rPr>
+        <w:t>гюле</w:t>
+      </w:r>
+      <w:proofErr w:type="spellEnd"/>
+      <w:r>
+        <w:rPr>
+          <w:rFonts w:ascii="Times New Roman" w:hAnsi="Times New Roman" w:cs="Times New Roman"/>
+          <w:sz w:val="24"/>
+          <w:szCs w:val="24"/>
+          <w:lang w:val="ru-RU"/>
+        </w:rPr>
+        <w:t xml:space="preserve">, то различия будут минимальны — только в степени интенсивности </w:t>
+      </w:r>
+      <w:proofErr w:type="spellStart"/>
+      <w:r>
+        <w:rPr>
+          <w:rFonts w:ascii="Times New Roman" w:hAnsi="Times New Roman" w:cs="Times New Roman"/>
+          <w:i/>
+          <w:iCs/>
+          <w:sz w:val="24"/>
+          <w:szCs w:val="24"/>
+          <w:lang w:val="ru-RU"/>
+        </w:rPr>
+        <w:t>пневмы</w:t>
+      </w:r>
+      <w:proofErr w:type="spellEnd"/>
+      <w:r>
+        <w:rPr>
+          <w:rFonts w:ascii="Times New Roman" w:hAnsi="Times New Roman" w:cs="Times New Roman"/>
+          <w:sz w:val="24"/>
+          <w:szCs w:val="24"/>
+          <w:lang w:val="ru-RU"/>
+        </w:rPr>
+        <w:t xml:space="preserve">. Более того, между человеком и пылью есть некое </w:t>
+      </w:r>
+      <w:r>
+        <w:rPr>
+          <w:rFonts w:ascii="Times New Roman" w:hAnsi="Times New Roman" w:cs="Times New Roman"/>
+          <w:i/>
+          <w:sz w:val="24"/>
+          <w:szCs w:val="24"/>
+          <w:lang w:val="ru-RU"/>
+        </w:rPr>
+        <w:t>сродство</w:t>
+      </w:r>
+      <w:r>
+        <w:rPr>
+          <w:rFonts w:ascii="Times New Roman" w:hAnsi="Times New Roman" w:cs="Times New Roman"/>
+          <w:sz w:val="24"/>
+          <w:szCs w:val="24"/>
+          <w:lang w:val="ru-RU"/>
+        </w:rPr>
+        <w:t>.</w:t>
+      </w:r>
+    </w:p>
+    <w:p>
+      <w:pPr>
+        <w:rPr>
+          <w:rFonts w:ascii="Times New Roman" w:hAnsi="Times New Roman" w:cs="Times New Roman"/>
+          <w:sz w:val="24"/>
+          <w:szCs w:val="24"/>
+          <w:lang w:val="ru-RU"/>
+        </w:rPr>
+      </w:pPr>
+      <w:r>
+        <w:rPr>
+          <w:rFonts w:ascii="Times New Roman" w:hAnsi="Times New Roman" w:cs="Times New Roman"/>
+          <w:bCs/>
+          <w:sz w:val="24"/>
+          <w:szCs w:val="24"/>
+          <w:lang w:val="ru-RU"/>
+        </w:rPr>
+        <w:t>κα</w:t>
+      </w:r>
+      <w:proofErr w:type="spellStart"/>
+      <w:r>
+        <w:rPr>
+          <w:rFonts w:ascii="Times New Roman" w:hAnsi="Times New Roman" w:cs="Times New Roman"/>
+          <w:bCs/>
+          <w:sz w:val="24"/>
+          <w:szCs w:val="24"/>
+          <w:lang w:val="ru-RU"/>
+        </w:rPr>
+        <w:t>θήκοντ</w:t>
+      </w:r>
+      <w:proofErr w:type="spellEnd"/>
+      <w:r>
+        <w:rPr>
+          <w:rFonts w:ascii="Times New Roman" w:hAnsi="Times New Roman" w:cs="Times New Roman"/>
+          <w:bCs/>
+          <w:sz w:val="24"/>
+          <w:szCs w:val="24"/>
+          <w:lang w:val="ru-RU"/>
+        </w:rPr>
+        <w:t>α</w:t>
+      </w:r>
+      <w:r>
+        <w:rPr>
+          <w:rFonts w:ascii="Times New Roman" w:hAnsi="Times New Roman" w:cs="Times New Roman"/>
+          <w:bCs/>
+          <w:sz w:val="24"/>
+          <w:szCs w:val="24"/>
+          <w:lang w:val="ru-RU"/>
+        </w:rPr>
+        <w:t xml:space="preserve"> </w:t>
+      </w:r>
+      <w:r>
+        <w:rPr>
+          <w:rFonts w:ascii="Times New Roman" w:hAnsi="Times New Roman" w:cs="Times New Roman"/>
+          <w:bCs/>
+          <w:sz w:val="24"/>
+          <w:szCs w:val="24"/>
+        </w:rPr>
+        <w:t>[</w:t>
+      </w:r>
+      <w:proofErr w:type="spellStart"/>
+      <w:r>
+        <w:rPr>
+          <w:rFonts w:ascii="Times New Roman" w:hAnsi="Times New Roman" w:cs="Times New Roman"/>
+          <w:b/>
+          <w:sz w:val="24"/>
+          <w:szCs w:val="24"/>
+          <w:lang w:val="ru-RU"/>
+        </w:rPr>
+        <w:t>к</w:t>
+      </w:r>
+      <w:r>
+        <w:rPr>
+          <w:rFonts w:ascii="Times New Roman" w:hAnsi="Times New Roman" w:cs="Times New Roman"/>
+          <w:b/>
+          <w:sz w:val="24"/>
+          <w:szCs w:val="24"/>
+          <w:lang w:val="ru-RU"/>
+        </w:rPr>
+        <w:t>атеконта</w:t>
+      </w:r>
+      <w:proofErr w:type="spellEnd"/>
+      <w:r>
+        <w:rPr>
+          <w:rFonts w:ascii="Times New Roman" w:hAnsi="Times New Roman" w:cs="Times New Roman"/>
+          <w:bCs/>
+          <w:sz w:val="24"/>
+          <w:szCs w:val="24"/>
+        </w:rPr>
+        <w:t>]</w:t>
+      </w:r>
+      <w:r>
+        <w:rPr>
+          <w:rFonts w:ascii="Times New Roman" w:hAnsi="Times New Roman" w:cs="Times New Roman"/>
+          <w:sz w:val="24"/>
+          <w:szCs w:val="24"/>
+          <w:lang w:val="ru-RU"/>
+        </w:rPr>
+        <w:t xml:space="preserve"> </w:t>
+      </w:r>
+      <w:r>
+        <w:rPr>
+          <w:rFonts w:ascii="Times New Roman" w:hAnsi="Times New Roman" w:cs="Times New Roman"/>
+          <w:sz w:val="24"/>
+          <w:szCs w:val="24"/>
+        </w:rPr>
+        <w:t xml:space="preserve">— </w:t>
+      </w:r>
+      <w:r>
+        <w:rPr>
+          <w:rFonts w:ascii="Times New Roman" w:hAnsi="Times New Roman" w:cs="Times New Roman"/>
+          <w:sz w:val="24"/>
+          <w:szCs w:val="24"/>
+          <w:lang w:val="ru-RU"/>
+        </w:rPr>
+        <w:t>должное, надлежащее. Пыль движется только в должном направлении. К движущейся колеснице прикованы два человека: один сопротивляется движению, другой следует за колесницей. Второй человек совершает должное. Важно</w:t>
+      </w:r>
+      <w:r>
+        <w:rPr>
+          <w:rFonts w:ascii="Times New Roman" w:hAnsi="Times New Roman" w:cs="Times New Roman"/>
+          <w:sz w:val="24"/>
+          <w:szCs w:val="24"/>
+          <w:lang w:val="ru-RU"/>
+        </w:rPr>
+        <w:t>:</w:t>
+      </w:r>
+      <w:r>
+        <w:rPr>
+          <w:rFonts w:ascii="Times New Roman" w:hAnsi="Times New Roman" w:cs="Times New Roman"/>
+          <w:sz w:val="24"/>
+          <w:szCs w:val="24"/>
+          <w:lang w:val="ru-RU"/>
+        </w:rPr>
+        <w:t xml:space="preserve"> </w:t>
+      </w:r>
+      <w:r>
+        <w:rPr>
+          <w:rFonts w:ascii="Times New Roman" w:hAnsi="Times New Roman" w:cs="Times New Roman"/>
+          <w:sz w:val="24"/>
+          <w:szCs w:val="24"/>
+          <w:lang w:val="ru-RU"/>
+        </w:rPr>
+        <w:t>п</w:t>
+      </w:r>
+      <w:r>
+        <w:rPr>
+          <w:rFonts w:ascii="Times New Roman" w:hAnsi="Times New Roman" w:cs="Times New Roman"/>
+          <w:sz w:val="24"/>
+          <w:szCs w:val="24"/>
+          <w:lang w:val="ru-RU"/>
+        </w:rPr>
+        <w:t>од должным не имеются в виду какие-либо моральные нормы</w:t>
+      </w:r>
+      <w:r>
+        <w:rPr>
+          <w:rFonts w:ascii="Times New Roman" w:hAnsi="Times New Roman" w:cs="Times New Roman"/>
+          <w:sz w:val="24"/>
+          <w:szCs w:val="24"/>
+          <w:lang w:val="ru-RU"/>
+        </w:rPr>
+        <w:t>.</w:t>
+      </w:r>
+      <w:r>
+        <w:rPr>
+          <w:rFonts w:ascii="Times New Roman" w:hAnsi="Times New Roman" w:cs="Times New Roman"/>
+          <w:sz w:val="24"/>
+          <w:szCs w:val="24"/>
+          <w:lang w:val="ru-RU"/>
+        </w:rPr>
+        <w:t xml:space="preserve"> Таких норм в принципе нету. Есть только силы, которые на нас действуют: природные, социальные и</w:t>
+      </w:r>
+      <w:r>
+        <w:rPr>
+          <w:rFonts w:ascii="Times New Roman" w:hAnsi="Times New Roman" w:cs="Times New Roman"/>
+          <w:sz w:val="24"/>
+          <w:szCs w:val="24"/>
+          <w:lang w:val="ru-RU"/>
+        </w:rPr>
+        <w:t xml:space="preserve"> </w:t>
+      </w:r>
+      <w:r>
+        <w:rPr>
+          <w:rFonts w:ascii="Times New Roman" w:hAnsi="Times New Roman" w:cs="Times New Roman"/>
+          <w:sz w:val="24"/>
+          <w:szCs w:val="24"/>
+          <w:lang w:val="ru-RU"/>
+        </w:rPr>
+        <w:t>т</w:t>
+      </w:r>
+      <w:r>
+        <w:rPr>
+          <w:rFonts w:ascii="Times New Roman" w:hAnsi="Times New Roman" w:cs="Times New Roman"/>
+          <w:sz w:val="24"/>
+          <w:szCs w:val="24"/>
+          <w:lang w:val="ru-RU"/>
+        </w:rPr>
+        <w:t>.</w:t>
+      </w:r>
+      <w:r>
+        <w:rPr>
+          <w:rFonts w:ascii="Times New Roman" w:hAnsi="Times New Roman" w:cs="Times New Roman"/>
+          <w:sz w:val="24"/>
+          <w:szCs w:val="24"/>
+          <w:lang w:val="ru-RU"/>
+        </w:rPr>
+        <w:t xml:space="preserve">п. И человек должен не сопротивляться им, а следовать воздействию, которое на </w:t>
+      </w:r>
+      <w:r>
+        <w:rPr>
+          <w:rFonts w:ascii="Times New Roman" w:hAnsi="Times New Roman" w:cs="Times New Roman"/>
+          <w:sz w:val="24"/>
+          <w:szCs w:val="24"/>
+          <w:lang w:val="ru-RU"/>
+        </w:rPr>
+        <w:t>него</w:t>
+      </w:r>
+      <w:r>
+        <w:rPr>
+          <w:rFonts w:ascii="Times New Roman" w:hAnsi="Times New Roman" w:cs="Times New Roman"/>
+          <w:sz w:val="24"/>
+          <w:szCs w:val="24"/>
+          <w:lang w:val="ru-RU"/>
+        </w:rPr>
+        <w:t xml:space="preserve"> влияет, чтобы не чувствовать страдание. Стоический мудрец не должен сопротивляться внешним силам, </w:t>
+      </w:r>
+      <w:r>
+        <w:rPr>
+          <w:rFonts w:ascii="Times New Roman" w:hAnsi="Times New Roman" w:cs="Times New Roman"/>
+          <w:sz w:val="24"/>
+          <w:szCs w:val="24"/>
+          <w:lang w:val="ru-RU"/>
+        </w:rPr>
+        <w:t xml:space="preserve">он должен </w:t>
+      </w:r>
+      <w:r>
+        <w:rPr>
+          <w:rFonts w:ascii="Times New Roman" w:hAnsi="Times New Roman" w:cs="Times New Roman"/>
+          <w:sz w:val="24"/>
+          <w:szCs w:val="24"/>
+          <w:lang w:val="ru-RU"/>
+        </w:rPr>
+        <w:t xml:space="preserve">следовать их направлению. Именно такая позиция позволит достичь </w:t>
+      </w:r>
+      <w:r>
+        <w:rPr>
+          <w:rFonts w:ascii="Times New Roman" w:hAnsi="Times New Roman" w:cs="Times New Roman"/>
+          <w:i/>
+          <w:iCs/>
+          <w:sz w:val="24"/>
+          <w:szCs w:val="24"/>
+          <w:lang w:val="ru-RU"/>
+        </w:rPr>
+        <w:t>атараксии</w:t>
+      </w:r>
+      <w:r>
+        <w:rPr>
+          <w:rFonts w:ascii="Times New Roman" w:hAnsi="Times New Roman" w:cs="Times New Roman"/>
+          <w:sz w:val="24"/>
+          <w:szCs w:val="24"/>
+          <w:lang w:val="ru-RU"/>
+        </w:rPr>
+        <w:t>.</w:t>
+      </w:r>
+    </w:p>
+    <w:p>
+      <w:pPr>
+        <w:rPr>
+          <w:rFonts w:ascii="Times New Roman" w:hAnsi="Times New Roman" w:cs="Times New Roman"/>
+          <w:sz w:val="24"/>
+          <w:szCs w:val="24"/>
+          <w:lang w:val="ru-RU"/>
+        </w:rPr>
+      </w:pPr>
+      <w:r>
+        <w:rPr>
+          <w:rFonts w:ascii="Times New Roman" w:hAnsi="Times New Roman" w:cs="Times New Roman"/>
+          <w:sz w:val="24"/>
+          <w:szCs w:val="24"/>
+          <w:lang w:val="ru-RU"/>
+        </w:rPr>
+        <w:t>Одна из проблем стоиков в том, что если достичь этого состояния так легко, то почему никто не следует стоицизму?</w:t>
+      </w:r>
+    </w:p>
+    <w:p>
+      <w:pPr>
+        <w:rPr>
+          <w:rFonts w:ascii="Times New Roman" w:hAnsi="Times New Roman" w:cs="Times New Roman"/>
+          <w:sz w:val="24"/>
+          <w:szCs w:val="24"/>
           <w:lang w:val="ru-RU"/>
         </w:rPr>
       </w:pPr>
@@ -1614,6 +3466,37 @@
     <w:semiHidden/>
     <w:unhideWhenUsed/>
   </w:style>
+  <w:style w:type="paragraph" w:styleId="Quote">
+    <w:name w:val="Quote"/>
+    <w:basedOn w:val="Normal"/>
+    <w:next w:val="Normal"/>
+    <w:link w:val="QuoteChar"/>
+    <w:uiPriority w:val="29"/>
+    <w:qFormat/>
+    <w:rsid w:val="00DF2AEF"/>
+    <w:pPr>
+      <w:spacing w:before="200"/>
+      <w:ind w:left="864" w:right="864"/>
+      <w:jc w:val="center"/>
+    </w:pPr>
+    <w:rPr>
+      <w:i/>
+      <w:iCs/>
+      <w:color w:val="404040" w:themeColor="text1" w:themeTint="BF"/>
+    </w:rPr>
+  </w:style>
+  <w:style w:type="character" w:customStyle="1" w:styleId="QuoteChar">
+    <w:name w:val="Quote Char"/>
+    <w:basedOn w:val="DefaultParagraphFont"/>
+    <w:link w:val="Quote"/>
+    <w:uiPriority w:val="29"/>
+    <w:rsid w:val="00DF2AEF"/>
+    <w:rPr>
+      <w:i/>
+      <w:iCs/>
+      <w:color w:val="404040" w:themeColor="text1" w:themeTint="BF"/>
+    </w:rPr>
+  </w:style>
 </w:styles>
 </file>
 

</xml_diff>